<commit_message>
fix(manuscript): fix overlapping tables and section column breaks in docx files
</commit_message>
<xml_diff>
--- a/docs/manuscript/en/manuscript.docx
+++ b/docs/manuscript/en/manuscript.docx
@@ -290,6 +290,7 @@
     </w:p>
     <w:p>
       <w:pPr>
+        <w:keepNext w:val="0"/>
         <w:spacing w:before="40" w:after="160"/>
         <w:jc w:val="center"/>
       </w:pPr>
@@ -361,6 +362,7 @@
     </w:p>
     <w:p>
       <w:pPr>
+        <w:keepNext/>
         <w:spacing w:before="40" w:after="160"/>
         <w:jc w:val="center"/>
       </w:pPr>
@@ -378,12 +380,13 @@
       <w:tblPr>
         <w:tblW w:type="auto" w:w="0"/>
         <w:jc w:val="center"/>
+        <w:tblLayout w:type="fixed"/>
         <w:tblLook w:firstColumn="1" w:firstRow="1" w:lastColumn="0" w:lastRow="0" w:noHBand="0" w:noVBand="1" w:val="04A0"/>
       </w:tblPr>
       <w:tblGrid>
-        <w:gridCol w:w="3010"/>
-        <w:gridCol w:w="3010"/>
-        <w:gridCol w:w="3010"/>
+        <w:gridCol w:w="1440"/>
+        <w:gridCol w:w="1368"/>
+        <w:gridCol w:w="1368"/>
       </w:tblGrid>
       <w:tr>
         <w:trPr>
@@ -391,7 +394,7 @@
         </w:trPr>
         <w:tc>
           <w:tcPr>
-            <w:tcW w:type="dxa" w:w="3010"/>
+            <w:tcW w:type="dxa" w:w="1440"/>
             <w:vAlign w:val="center"/>
             <w:shd w:fill="F2F4F4"/>
             <w:tcBorders>
@@ -411,7 +414,7 @@
                 <w:rFonts w:ascii="Times New Roman" w:hAnsi="Times New Roman"/>
                 <w:b/>
                 <w:color w:val="000000"/>
-                <w:sz w:val="17"/>
+                <w:sz w:val="16"/>
               </w:rPr>
               <w:t>Variable</w:t>
             </w:r>
@@ -419,7 +422,7 @@
         </w:tc>
         <w:tc>
           <w:tcPr>
-            <w:tcW w:type="dxa" w:w="3010"/>
+            <w:tcW w:type="dxa" w:w="1368"/>
             <w:vAlign w:val="center"/>
             <w:shd w:fill="F2F4F4"/>
             <w:tcBorders>
@@ -439,7 +442,7 @@
                 <w:rFonts w:ascii="Times New Roman" w:hAnsi="Times New Roman"/>
                 <w:b/>
                 <w:color w:val="000000"/>
-                <w:sz w:val="17"/>
+                <w:sz w:val="16"/>
               </w:rPr>
               <w:t>Definition and unit</w:t>
             </w:r>
@@ -447,7 +450,7 @@
         </w:tc>
         <w:tc>
           <w:tcPr>
-            <w:tcW w:type="dxa" w:w="3010"/>
+            <w:tcW w:type="dxa" w:w="1368"/>
             <w:vAlign w:val="center"/>
             <w:shd w:fill="F2F4F4"/>
             <w:tcBorders>
@@ -467,7 +470,7 @@
                 <w:rFonts w:ascii="Times New Roman" w:hAnsi="Times New Roman"/>
                 <w:b/>
                 <w:color w:val="000000"/>
-                <w:sz w:val="17"/>
+                <w:sz w:val="16"/>
               </w:rPr>
               <w:t>Expected sign</w:t>
             </w:r>
@@ -480,7 +483,7 @@
         </w:trPr>
         <w:tc>
           <w:tcPr>
-            <w:tcW w:type="dxa" w:w="3010"/>
+            <w:tcW w:type="dxa" w:w="1440"/>
             <w:vAlign w:val="center"/>
             <w:tcBorders>
               <w:top w:val="none" w:sz="4" w:space="0" w:color="000000"/>
@@ -498,7 +501,7 @@
               <w:rPr>
                 <w:rFonts w:ascii="Times New Roman" w:hAnsi="Times New Roman"/>
                 <w:color w:val="000000"/>
-                <w:sz w:val="17"/>
+                <w:sz w:val="16"/>
               </w:rPr>
               <w:t>Time</w:t>
             </w:r>
@@ -506,7 +509,7 @@
         </w:tc>
         <w:tc>
           <w:tcPr>
-            <w:tcW w:type="dxa" w:w="3010"/>
+            <w:tcW w:type="dxa" w:w="1368"/>
             <w:vAlign w:val="center"/>
             <w:tcBorders>
               <w:top w:val="none" w:sz="4" w:space="0" w:color="000000"/>
@@ -524,7 +527,7 @@
               <w:rPr>
                 <w:rFonts w:ascii="Times New Roman" w:hAnsi="Times New Roman"/>
                 <w:color w:val="000000"/>
-                <w:sz w:val="17"/>
+                <w:sz w:val="16"/>
               </w:rPr>
               <w:t>Total travel time, minutes</w:t>
             </w:r>
@@ -532,7 +535,7 @@
         </w:tc>
         <w:tc>
           <w:tcPr>
-            <w:tcW w:type="dxa" w:w="3010"/>
+            <w:tcW w:type="dxa" w:w="1368"/>
             <w:vAlign w:val="center"/>
             <w:tcBorders>
               <w:top w:val="none" w:sz="4" w:space="0" w:color="000000"/>
@@ -550,7 +553,7 @@
               <w:rPr>
                 <w:rFonts w:ascii="Times New Roman" w:hAnsi="Times New Roman"/>
                 <w:color w:val="000000"/>
-                <w:sz w:val="17"/>
+                <w:sz w:val="16"/>
               </w:rPr>
               <w:t>−</w:t>
             </w:r>
@@ -563,7 +566,7 @@
         </w:trPr>
         <w:tc>
           <w:tcPr>
-            <w:tcW w:type="dxa" w:w="3010"/>
+            <w:tcW w:type="dxa" w:w="1440"/>
             <w:vAlign w:val="center"/>
             <w:tcBorders>
               <w:top w:val="none" w:sz="4" w:space="0" w:color="000000"/>
@@ -581,7 +584,7 @@
               <w:rPr>
                 <w:rFonts w:ascii="Times New Roman" w:hAnsi="Times New Roman"/>
                 <w:color w:val="000000"/>
-                <w:sz w:val="17"/>
+                <w:sz w:val="16"/>
               </w:rPr>
               <w:t>Cost</w:t>
             </w:r>
@@ -589,7 +592,7 @@
         </w:tc>
         <w:tc>
           <w:tcPr>
-            <w:tcW w:type="dxa" w:w="3010"/>
+            <w:tcW w:type="dxa" w:w="1368"/>
             <w:vAlign w:val="center"/>
             <w:tcBorders>
               <w:top w:val="none" w:sz="4" w:space="0" w:color="000000"/>
@@ -607,7 +610,7 @@
               <w:rPr>
                 <w:rFonts w:ascii="Times New Roman" w:hAnsi="Times New Roman"/>
                 <w:color w:val="000000"/>
-                <w:sz w:val="17"/>
+                <w:sz w:val="16"/>
               </w:rPr>
               <w:t>Total travel cost, Indonesian rupiah</w:t>
             </w:r>
@@ -615,7 +618,7 @@
         </w:tc>
         <w:tc>
           <w:tcPr>
-            <w:tcW w:type="dxa" w:w="3010"/>
+            <w:tcW w:type="dxa" w:w="1368"/>
             <w:vAlign w:val="center"/>
             <w:tcBorders>
               <w:top w:val="none" w:sz="4" w:space="0" w:color="000000"/>
@@ -633,7 +636,7 @@
               <w:rPr>
                 <w:rFonts w:ascii="Times New Roman" w:hAnsi="Times New Roman"/>
                 <w:color w:val="000000"/>
-                <w:sz w:val="17"/>
+                <w:sz w:val="16"/>
               </w:rPr>
               <w:t>−</w:t>
             </w:r>
@@ -646,7 +649,7 @@
         </w:trPr>
         <w:tc>
           <w:tcPr>
-            <w:tcW w:type="dxa" w:w="3010"/>
+            <w:tcW w:type="dxa" w:w="1440"/>
             <w:vAlign w:val="center"/>
             <w:tcBorders>
               <w:top w:val="none" w:sz="4" w:space="0" w:color="000000"/>
@@ -664,7 +667,7 @@
               <w:rPr>
                 <w:rFonts w:ascii="Times New Roman" w:hAnsi="Times New Roman"/>
                 <w:color w:val="000000"/>
-                <w:sz w:val="17"/>
+                <w:sz w:val="16"/>
               </w:rPr>
               <w:t>Transfers</w:t>
             </w:r>
@@ -672,7 +675,7 @@
         </w:tc>
         <w:tc>
           <w:tcPr>
-            <w:tcW w:type="dxa" w:w="3010"/>
+            <w:tcW w:type="dxa" w:w="1368"/>
             <w:vAlign w:val="center"/>
             <w:tcBorders>
               <w:top w:val="none" w:sz="4" w:space="0" w:color="000000"/>
@@ -690,7 +693,7 @@
               <w:rPr>
                 <w:rFonts w:ascii="Times New Roman" w:hAnsi="Times New Roman"/>
                 <w:color w:val="000000"/>
-                <w:sz w:val="17"/>
+                <w:sz w:val="16"/>
               </w:rPr>
               <w:t>Number of vehicle changes</w:t>
             </w:r>
@@ -698,7 +701,7 @@
         </w:tc>
         <w:tc>
           <w:tcPr>
-            <w:tcW w:type="dxa" w:w="3010"/>
+            <w:tcW w:type="dxa" w:w="1368"/>
             <w:vAlign w:val="center"/>
             <w:tcBorders>
               <w:top w:val="none" w:sz="4" w:space="0" w:color="000000"/>
@@ -716,7 +719,7 @@
               <w:rPr>
                 <w:rFonts w:ascii="Times New Roman" w:hAnsi="Times New Roman"/>
                 <w:color w:val="000000"/>
-                <w:sz w:val="17"/>
+                <w:sz w:val="16"/>
               </w:rPr>
               <w:t>−</w:t>
             </w:r>
@@ -729,7 +732,7 @@
         </w:trPr>
         <w:tc>
           <w:tcPr>
-            <w:tcW w:type="dxa" w:w="3010"/>
+            <w:tcW w:type="dxa" w:w="1440"/>
             <w:vAlign w:val="center"/>
             <w:tcBorders>
               <w:top w:val="none" w:sz="4" w:space="0" w:color="000000"/>
@@ -747,7 +750,7 @@
               <w:rPr>
                 <w:rFonts w:ascii="Times New Roman" w:hAnsi="Times New Roman"/>
                 <w:color w:val="000000"/>
-                <w:sz w:val="17"/>
+                <w:sz w:val="16"/>
               </w:rPr>
               <w:t>Access distance</w:t>
             </w:r>
@@ -755,7 +758,7 @@
         </w:tc>
         <w:tc>
           <w:tcPr>
-            <w:tcW w:type="dxa" w:w="3010"/>
+            <w:tcW w:type="dxa" w:w="1368"/>
             <w:vAlign w:val="center"/>
             <w:tcBorders>
               <w:top w:val="none" w:sz="4" w:space="0" w:color="000000"/>
@@ -773,7 +776,7 @@
               <w:rPr>
                 <w:rFonts w:ascii="Times New Roman" w:hAnsi="Times New Roman"/>
                 <w:color w:val="000000"/>
-                <w:sz w:val="17"/>
+                <w:sz w:val="16"/>
               </w:rPr>
               <w:t>First/last-mile distance, km</w:t>
             </w:r>
@@ -781,7 +784,7 @@
         </w:tc>
         <w:tc>
           <w:tcPr>
-            <w:tcW w:type="dxa" w:w="3010"/>
+            <w:tcW w:type="dxa" w:w="1368"/>
             <w:vAlign w:val="center"/>
             <w:tcBorders>
               <w:top w:val="none" w:sz="4" w:space="0" w:color="000000"/>
@@ -799,7 +802,7 @@
               <w:rPr>
                 <w:rFonts w:ascii="Times New Roman" w:hAnsi="Times New Roman"/>
                 <w:color w:val="000000"/>
-                <w:sz w:val="17"/>
+                <w:sz w:val="16"/>
               </w:rPr>
               <w:t>−</w:t>
             </w:r>
@@ -812,7 +815,7 @@
         </w:trPr>
         <w:tc>
           <w:tcPr>
-            <w:tcW w:type="dxa" w:w="3010"/>
+            <w:tcW w:type="dxa" w:w="1440"/>
             <w:vAlign w:val="center"/>
             <w:tcBorders>
               <w:top w:val="none" w:sz="4" w:space="0" w:color="000000"/>
@@ -830,7 +833,7 @@
               <w:rPr>
                 <w:rFonts w:ascii="Times New Roman" w:hAnsi="Times New Roman"/>
                 <w:color w:val="000000"/>
-                <w:sz w:val="17"/>
+                <w:sz w:val="16"/>
               </w:rPr>
               <w:t>Comfort</w:t>
             </w:r>
@@ -838,7 +841,7 @@
         </w:tc>
         <w:tc>
           <w:tcPr>
-            <w:tcW w:type="dxa" w:w="3010"/>
+            <w:tcW w:type="dxa" w:w="1368"/>
             <w:vAlign w:val="center"/>
             <w:tcBorders>
               <w:top w:val="none" w:sz="4" w:space="0" w:color="000000"/>
@@ -856,7 +859,7 @@
               <w:rPr>
                 <w:rFonts w:ascii="Times New Roman" w:hAnsi="Times New Roman"/>
                 <w:color w:val="000000"/>
-                <w:sz w:val="17"/>
+                <w:sz w:val="16"/>
               </w:rPr>
               <w:t>System score, 0–5</w:t>
             </w:r>
@@ -864,7 +867,7 @@
         </w:tc>
         <w:tc>
           <w:tcPr>
-            <w:tcW w:type="dxa" w:w="3010"/>
+            <w:tcW w:type="dxa" w:w="1368"/>
             <w:vAlign w:val="center"/>
             <w:tcBorders>
               <w:top w:val="none" w:sz="4" w:space="0" w:color="000000"/>
@@ -882,7 +885,7 @@
               <w:rPr>
                 <w:rFonts w:ascii="Times New Roman" w:hAnsi="Times New Roman"/>
                 <w:color w:val="000000"/>
-                <w:sz w:val="17"/>
+                <w:sz w:val="16"/>
               </w:rPr>
               <w:t>+</w:t>
             </w:r>
@@ -895,7 +898,7 @@
         </w:trPr>
         <w:tc>
           <w:tcPr>
-            <w:tcW w:type="dxa" w:w="3010"/>
+            <w:tcW w:type="dxa" w:w="1440"/>
             <w:vAlign w:val="center"/>
             <w:tcBorders>
               <w:top w:val="none" w:sz="4" w:space="0" w:color="000000"/>
@@ -913,7 +916,7 @@
               <w:rPr>
                 <w:rFonts w:ascii="Times New Roman" w:hAnsi="Times New Roman"/>
                 <w:color w:val="000000"/>
-                <w:sz w:val="17"/>
+                <w:sz w:val="16"/>
               </w:rPr>
               <w:t>Reliability</w:t>
             </w:r>
@@ -921,7 +924,7 @@
         </w:tc>
         <w:tc>
           <w:tcPr>
-            <w:tcW w:type="dxa" w:w="3010"/>
+            <w:tcW w:type="dxa" w:w="1368"/>
             <w:vAlign w:val="center"/>
             <w:tcBorders>
               <w:top w:val="none" w:sz="4" w:space="0" w:color="000000"/>
@@ -939,7 +942,7 @@
               <w:rPr>
                 <w:rFonts w:ascii="Times New Roman" w:hAnsi="Times New Roman"/>
                 <w:color w:val="000000"/>
-                <w:sz w:val="17"/>
+                <w:sz w:val="16"/>
               </w:rPr>
               <w:t>System score, 0–5</w:t>
             </w:r>
@@ -947,7 +950,7 @@
         </w:tc>
         <w:tc>
           <w:tcPr>
-            <w:tcW w:type="dxa" w:w="3010"/>
+            <w:tcW w:type="dxa" w:w="1368"/>
             <w:vAlign w:val="center"/>
             <w:tcBorders>
               <w:top w:val="none" w:sz="4" w:space="0" w:color="000000"/>
@@ -965,7 +968,7 @@
               <w:rPr>
                 <w:rFonts w:ascii="Times New Roman" w:hAnsi="Times New Roman"/>
                 <w:color w:val="000000"/>
-                <w:sz w:val="17"/>
+                <w:sz w:val="16"/>
               </w:rPr>
               <w:t>+</w:t>
             </w:r>
@@ -978,7 +981,7 @@
         </w:trPr>
         <w:tc>
           <w:tcPr>
-            <w:tcW w:type="dxa" w:w="3010"/>
+            <w:tcW w:type="dxa" w:w="1440"/>
             <w:vAlign w:val="center"/>
             <w:tcBorders>
               <w:top w:val="none" w:sz="4" w:space="0" w:color="000000"/>
@@ -996,7 +999,7 @@
               <w:rPr>
                 <w:rFonts w:ascii="Times New Roman" w:hAnsi="Times New Roman"/>
                 <w:color w:val="000000"/>
-                <w:sz w:val="17"/>
+                <w:sz w:val="16"/>
               </w:rPr>
               <w:t>Private-vehicle ASC</w:t>
             </w:r>
@@ -1004,7 +1007,7 @@
         </w:tc>
         <w:tc>
           <w:tcPr>
-            <w:tcW w:type="dxa" w:w="3010"/>
+            <w:tcW w:type="dxa" w:w="1368"/>
             <w:vAlign w:val="center"/>
             <w:tcBorders>
               <w:top w:val="none" w:sz="4" w:space="0" w:color="000000"/>
@@ -1022,7 +1025,7 @@
               <w:rPr>
                 <w:rFonts w:ascii="Times New Roman" w:hAnsi="Times New Roman"/>
                 <w:color w:val="000000"/>
-                <w:sz w:val="17"/>
+                <w:sz w:val="16"/>
               </w:rPr>
               <w:t>Private-vehicle indicator</w:t>
             </w:r>
@@ -1030,7 +1033,7 @@
         </w:tc>
         <w:tc>
           <w:tcPr>
-            <w:tcW w:type="dxa" w:w="3010"/>
+            <w:tcW w:type="dxa" w:w="1368"/>
             <w:vAlign w:val="center"/>
             <w:tcBorders>
               <w:top w:val="none" w:sz="4" w:space="0" w:color="000000"/>
@@ -1048,7 +1051,7 @@
               <w:rPr>
                 <w:rFonts w:ascii="Times New Roman" w:hAnsi="Times New Roman"/>
                 <w:color w:val="000000"/>
-                <w:sz w:val="17"/>
+                <w:sz w:val="16"/>
               </w:rPr>
               <w:t>Unrestricted</w:t>
             </w:r>
@@ -1076,6 +1079,7 @@
     </w:p>
     <w:p>
       <w:pPr>
+        <w:keepNext/>
         <w:spacing w:before="40" w:after="160"/>
         <w:jc w:val="center"/>
       </w:pPr>
@@ -1093,12 +1097,13 @@
       <w:tblPr>
         <w:tblW w:type="auto" w:w="0"/>
         <w:jc w:val="center"/>
+        <w:tblLayout w:type="fixed"/>
         <w:tblLook w:firstColumn="1" w:firstRow="1" w:lastColumn="0" w:lastRow="0" w:noHBand="0" w:noVBand="1" w:val="04A0"/>
       </w:tblPr>
       <w:tblGrid>
-        <w:gridCol w:w="3010"/>
-        <w:gridCol w:w="3010"/>
-        <w:gridCol w:w="3010"/>
+        <w:gridCol w:w="1440"/>
+        <w:gridCol w:w="1368"/>
+        <w:gridCol w:w="1368"/>
       </w:tblGrid>
       <w:tr>
         <w:trPr>
@@ -1106,7 +1111,7 @@
         </w:trPr>
         <w:tc>
           <w:tcPr>
-            <w:tcW w:type="dxa" w:w="3010"/>
+            <w:tcW w:type="dxa" w:w="1440"/>
             <w:vAlign w:val="center"/>
             <w:shd w:fill="F2F4F4"/>
             <w:tcBorders>
@@ -1126,7 +1131,7 @@
                 <w:rFonts w:ascii="Times New Roman" w:hAnsi="Times New Roman"/>
                 <w:b/>
                 <w:color w:val="000000"/>
-                <w:sz w:val="17"/>
+                <w:sz w:val="16"/>
               </w:rPr>
               <w:t>Characteristic</w:t>
             </w:r>
@@ -1134,7 +1139,7 @@
         </w:tc>
         <w:tc>
           <w:tcPr>
-            <w:tcW w:type="dxa" w:w="3010"/>
+            <w:tcW w:type="dxa" w:w="1368"/>
             <w:vAlign w:val="center"/>
             <w:shd w:fill="F2F4F4"/>
             <w:tcBorders>
@@ -1154,7 +1159,7 @@
                 <w:rFonts w:ascii="Times New Roman" w:hAnsi="Times New Roman"/>
                 <w:b/>
                 <w:color w:val="000000"/>
-                <w:sz w:val="17"/>
+                <w:sz w:val="16"/>
               </w:rPr>
               <w:t>Dominant category</w:t>
             </w:r>
@@ -1162,7 +1167,7 @@
         </w:tc>
         <w:tc>
           <w:tcPr>
-            <w:tcW w:type="dxa" w:w="3010"/>
+            <w:tcW w:type="dxa" w:w="1368"/>
             <w:vAlign w:val="center"/>
             <w:shd w:fill="F2F4F4"/>
             <w:tcBorders>
@@ -1182,7 +1187,7 @@
                 <w:rFonts w:ascii="Times New Roman" w:hAnsi="Times New Roman"/>
                 <w:b/>
                 <w:color w:val="000000"/>
-                <w:sz w:val="17"/>
+                <w:sz w:val="16"/>
               </w:rPr>
               <w:t>n (%)</w:t>
             </w:r>
@@ -1195,7 +1200,7 @@
         </w:trPr>
         <w:tc>
           <w:tcPr>
-            <w:tcW w:type="dxa" w:w="3010"/>
+            <w:tcW w:type="dxa" w:w="1440"/>
             <w:vAlign w:val="center"/>
             <w:tcBorders>
               <w:top w:val="none" w:sz="4" w:space="0" w:color="000000"/>
@@ -1213,7 +1218,7 @@
               <w:rPr>
                 <w:rFonts w:ascii="Times New Roman" w:hAnsi="Times New Roman"/>
                 <w:color w:val="000000"/>
-                <w:sz w:val="17"/>
+                <w:sz w:val="16"/>
               </w:rPr>
               <w:t>Gender</w:t>
             </w:r>
@@ -1221,7 +1226,7 @@
         </w:tc>
         <w:tc>
           <w:tcPr>
-            <w:tcW w:type="dxa" w:w="3010"/>
+            <w:tcW w:type="dxa" w:w="1368"/>
             <w:vAlign w:val="center"/>
             <w:tcBorders>
               <w:top w:val="none" w:sz="4" w:space="0" w:color="000000"/>
@@ -1239,7 +1244,7 @@
               <w:rPr>
                 <w:rFonts w:ascii="Times New Roman" w:hAnsi="Times New Roman"/>
                 <w:color w:val="000000"/>
-                <w:sz w:val="17"/>
+                <w:sz w:val="16"/>
               </w:rPr>
               <w:t>Female</w:t>
             </w:r>
@@ -1247,7 +1252,7 @@
         </w:tc>
         <w:tc>
           <w:tcPr>
-            <w:tcW w:type="dxa" w:w="3010"/>
+            <w:tcW w:type="dxa" w:w="1368"/>
             <w:vAlign w:val="center"/>
             <w:tcBorders>
               <w:top w:val="none" w:sz="4" w:space="0" w:color="000000"/>
@@ -1265,7 +1270,7 @@
               <w:rPr>
                 <w:rFonts w:ascii="Times New Roman" w:hAnsi="Times New Roman"/>
                 <w:color w:val="000000"/>
-                <w:sz w:val="17"/>
+                <w:sz w:val="16"/>
               </w:rPr>
               <w:t>157 (49.4)</w:t>
             </w:r>
@@ -1278,7 +1283,7 @@
         </w:trPr>
         <w:tc>
           <w:tcPr>
-            <w:tcW w:type="dxa" w:w="3010"/>
+            <w:tcW w:type="dxa" w:w="1440"/>
             <w:vAlign w:val="center"/>
             <w:tcBorders>
               <w:top w:val="none" w:sz="4" w:space="0" w:color="000000"/>
@@ -1296,7 +1301,7 @@
               <w:rPr>
                 <w:rFonts w:ascii="Times New Roman" w:hAnsi="Times New Roman"/>
                 <w:color w:val="000000"/>
-                <w:sz w:val="17"/>
+                <w:sz w:val="16"/>
               </w:rPr>
               <w:t>Occupation</w:t>
             </w:r>
@@ -1304,7 +1309,7 @@
         </w:tc>
         <w:tc>
           <w:tcPr>
-            <w:tcW w:type="dxa" w:w="3010"/>
+            <w:tcW w:type="dxa" w:w="1368"/>
             <w:vAlign w:val="center"/>
             <w:tcBorders>
               <w:top w:val="none" w:sz="4" w:space="0" w:color="000000"/>
@@ -1322,7 +1327,7 @@
               <w:rPr>
                 <w:rFonts w:ascii="Times New Roman" w:hAnsi="Times New Roman"/>
                 <w:color w:val="000000"/>
-                <w:sz w:val="17"/>
+                <w:sz w:val="16"/>
               </w:rPr>
               <w:t>Student</w:t>
             </w:r>
@@ -1330,7 +1335,7 @@
         </w:tc>
         <w:tc>
           <w:tcPr>
-            <w:tcW w:type="dxa" w:w="3010"/>
+            <w:tcW w:type="dxa" w:w="1368"/>
             <w:vAlign w:val="center"/>
             <w:tcBorders>
               <w:top w:val="none" w:sz="4" w:space="0" w:color="000000"/>
@@ -1348,7 +1353,7 @@
               <w:rPr>
                 <w:rFonts w:ascii="Times New Roman" w:hAnsi="Times New Roman"/>
                 <w:color w:val="000000"/>
-                <w:sz w:val="17"/>
+                <w:sz w:val="16"/>
               </w:rPr>
               <w:t>204 (64.2)</w:t>
             </w:r>
@@ -1361,7 +1366,7 @@
         </w:trPr>
         <w:tc>
           <w:tcPr>
-            <w:tcW w:type="dxa" w:w="3010"/>
+            <w:tcW w:type="dxa" w:w="1440"/>
             <w:vAlign w:val="center"/>
             <w:tcBorders>
               <w:top w:val="none" w:sz="4" w:space="0" w:color="000000"/>
@@ -1379,7 +1384,7 @@
               <w:rPr>
                 <w:rFonts w:ascii="Times New Roman" w:hAnsi="Times New Roman"/>
                 <w:color w:val="000000"/>
-                <w:sz w:val="17"/>
+                <w:sz w:val="16"/>
               </w:rPr>
               <w:t>Monthly income</w:t>
             </w:r>
@@ -1387,7 +1392,7 @@
         </w:tc>
         <w:tc>
           <w:tcPr>
-            <w:tcW w:type="dxa" w:w="3010"/>
+            <w:tcW w:type="dxa" w:w="1368"/>
             <w:vAlign w:val="center"/>
             <w:tcBorders>
               <w:top w:val="none" w:sz="4" w:space="0" w:color="000000"/>
@@ -1405,7 +1410,7 @@
               <w:rPr>
                 <w:rFonts w:ascii="Times New Roman" w:hAnsi="Times New Roman"/>
                 <w:color w:val="000000"/>
-                <w:sz w:val="17"/>
+                <w:sz w:val="16"/>
               </w:rPr>
               <w:t>&lt;IDR1 million</w:t>
             </w:r>
@@ -1413,7 +1418,7 @@
         </w:tc>
         <w:tc>
           <w:tcPr>
-            <w:tcW w:type="dxa" w:w="3010"/>
+            <w:tcW w:type="dxa" w:w="1368"/>
             <w:vAlign w:val="center"/>
             <w:tcBorders>
               <w:top w:val="none" w:sz="4" w:space="0" w:color="000000"/>
@@ -1431,7 +1436,7 @@
               <w:rPr>
                 <w:rFonts w:ascii="Times New Roman" w:hAnsi="Times New Roman"/>
                 <w:color w:val="000000"/>
-                <w:sz w:val="17"/>
+                <w:sz w:val="16"/>
               </w:rPr>
               <w:t>142 (44.7)</w:t>
             </w:r>
@@ -1444,7 +1449,7 @@
         </w:trPr>
         <w:tc>
           <w:tcPr>
-            <w:tcW w:type="dxa" w:w="3010"/>
+            <w:tcW w:type="dxa" w:w="1440"/>
             <w:vAlign w:val="center"/>
             <w:tcBorders>
               <w:top w:val="none" w:sz="4" w:space="0" w:color="000000"/>
@@ -1462,7 +1467,7 @@
               <w:rPr>
                 <w:rFonts w:ascii="Times New Roman" w:hAnsi="Times New Roman"/>
                 <w:color w:val="000000"/>
-                <w:sz w:val="17"/>
+                <w:sz w:val="16"/>
               </w:rPr>
               <w:t>Vehicle ownership</w:t>
             </w:r>
@@ -1470,7 +1475,7 @@
         </w:tc>
         <w:tc>
           <w:tcPr>
-            <w:tcW w:type="dxa" w:w="3010"/>
+            <w:tcW w:type="dxa" w:w="1368"/>
             <w:vAlign w:val="center"/>
             <w:tcBorders>
               <w:top w:val="none" w:sz="4" w:space="0" w:color="000000"/>
@@ -1488,7 +1493,7 @@
               <w:rPr>
                 <w:rFonts w:ascii="Times New Roman" w:hAnsi="Times New Roman"/>
                 <w:color w:val="000000"/>
-                <w:sz w:val="17"/>
+                <w:sz w:val="16"/>
               </w:rPr>
               <w:t>Motorcycle</w:t>
             </w:r>
@@ -1496,7 +1501,7 @@
         </w:tc>
         <w:tc>
           <w:tcPr>
-            <w:tcW w:type="dxa" w:w="3010"/>
+            <w:tcW w:type="dxa" w:w="1368"/>
             <w:vAlign w:val="center"/>
             <w:tcBorders>
               <w:top w:val="none" w:sz="4" w:space="0" w:color="000000"/>
@@ -1514,7 +1519,7 @@
               <w:rPr>
                 <w:rFonts w:ascii="Times New Roman" w:hAnsi="Times New Roman"/>
                 <w:color w:val="000000"/>
-                <w:sz w:val="17"/>
+                <w:sz w:val="16"/>
               </w:rPr>
               <w:t>164 (51.6)</w:t>
             </w:r>
@@ -1527,7 +1532,7 @@
         </w:trPr>
         <w:tc>
           <w:tcPr>
-            <w:tcW w:type="dxa" w:w="3010"/>
+            <w:tcW w:type="dxa" w:w="1440"/>
             <w:vAlign w:val="center"/>
             <w:tcBorders>
               <w:top w:val="none" w:sz="4" w:space="0" w:color="000000"/>
@@ -1545,7 +1550,7 @@
               <w:rPr>
                 <w:rFonts w:ascii="Times New Roman" w:hAnsi="Times New Roman"/>
                 <w:color w:val="000000"/>
-                <w:sz w:val="17"/>
+                <w:sz w:val="16"/>
               </w:rPr>
               <w:t>Trip purpose</w:t>
             </w:r>
@@ -1553,7 +1558,7 @@
         </w:tc>
         <w:tc>
           <w:tcPr>
-            <w:tcW w:type="dxa" w:w="3010"/>
+            <w:tcW w:type="dxa" w:w="1368"/>
             <w:vAlign w:val="center"/>
             <w:tcBorders>
               <w:top w:val="none" w:sz="4" w:space="0" w:color="000000"/>
@@ -1571,7 +1576,7 @@
               <w:rPr>
                 <w:rFonts w:ascii="Times New Roman" w:hAnsi="Times New Roman"/>
                 <w:color w:val="000000"/>
-                <w:sz w:val="17"/>
+                <w:sz w:val="16"/>
               </w:rPr>
               <w:t>School/university</w:t>
             </w:r>
@@ -1579,7 +1584,7 @@
         </w:tc>
         <w:tc>
           <w:tcPr>
-            <w:tcW w:type="dxa" w:w="3010"/>
+            <w:tcW w:type="dxa" w:w="1368"/>
             <w:vAlign w:val="center"/>
             <w:tcBorders>
               <w:top w:val="none" w:sz="4" w:space="0" w:color="000000"/>
@@ -1597,7 +1602,7 @@
               <w:rPr>
                 <w:rFonts w:ascii="Times New Roman" w:hAnsi="Times New Roman"/>
                 <w:color w:val="000000"/>
-                <w:sz w:val="17"/>
+                <w:sz w:val="16"/>
               </w:rPr>
               <w:t>164 (51.6)</w:t>
             </w:r>
@@ -1610,7 +1615,7 @@
         </w:trPr>
         <w:tc>
           <w:tcPr>
-            <w:tcW w:type="dxa" w:w="3010"/>
+            <w:tcW w:type="dxa" w:w="1440"/>
             <w:vAlign w:val="center"/>
             <w:tcBorders>
               <w:top w:val="none" w:sz="4" w:space="0" w:color="000000"/>
@@ -1628,7 +1633,7 @@
               <w:rPr>
                 <w:rFonts w:ascii="Times New Roman" w:hAnsi="Times New Roman"/>
                 <w:color w:val="000000"/>
-                <w:sz w:val="17"/>
+                <w:sz w:val="16"/>
               </w:rPr>
               <w:t>Public transport frequency</w:t>
             </w:r>
@@ -1636,7 +1641,7 @@
         </w:tc>
         <w:tc>
           <w:tcPr>
-            <w:tcW w:type="dxa" w:w="3010"/>
+            <w:tcW w:type="dxa" w:w="1368"/>
             <w:vAlign w:val="center"/>
             <w:tcBorders>
               <w:top w:val="none" w:sz="4" w:space="0" w:color="000000"/>
@@ -1654,7 +1659,7 @@
               <w:rPr>
                 <w:rFonts w:ascii="Times New Roman" w:hAnsi="Times New Roman"/>
                 <w:color w:val="000000"/>
-                <w:sz w:val="17"/>
+                <w:sz w:val="16"/>
               </w:rPr>
               <w:t>Several times a week</w:t>
             </w:r>
@@ -1662,7 +1667,7 @@
         </w:tc>
         <w:tc>
           <w:tcPr>
-            <w:tcW w:type="dxa" w:w="3010"/>
+            <w:tcW w:type="dxa" w:w="1368"/>
             <w:vAlign w:val="center"/>
             <w:tcBorders>
               <w:top w:val="none" w:sz="4" w:space="0" w:color="000000"/>
@@ -1680,7 +1685,7 @@
               <w:rPr>
                 <w:rFonts w:ascii="Times New Roman" w:hAnsi="Times New Roman"/>
                 <w:color w:val="000000"/>
-                <w:sz w:val="17"/>
+                <w:sz w:val="16"/>
               </w:rPr>
               <w:t>116 (36.5)</w:t>
             </w:r>
@@ -1737,6 +1742,7 @@
     </w:p>
     <w:p>
       <w:pPr>
+        <w:keepNext/>
         <w:spacing w:before="40" w:after="160"/>
         <w:jc w:val="center"/>
       </w:pPr>
@@ -1754,11 +1760,12 @@
       <w:tblPr>
         <w:tblW w:type="auto" w:w="0"/>
         <w:jc w:val="center"/>
+        <w:tblLayout w:type="fixed"/>
         <w:tblLook w:firstColumn="1" w:firstRow="1" w:lastColumn="0" w:lastRow="0" w:noHBand="0" w:noVBand="1" w:val="04A0"/>
       </w:tblPr>
       <w:tblGrid>
-        <w:gridCol w:w="4514"/>
-        <w:gridCol w:w="4514"/>
+        <w:gridCol w:w="2448"/>
+        <w:gridCol w:w="1728"/>
       </w:tblGrid>
       <w:tr>
         <w:trPr>
@@ -1766,7 +1773,7 @@
         </w:trPr>
         <w:tc>
           <w:tcPr>
-            <w:tcW w:type="dxa" w:w="4514"/>
+            <w:tcW w:type="dxa" w:w="2448"/>
             <w:vAlign w:val="center"/>
             <w:shd w:fill="F2F4F4"/>
             <w:tcBorders>
@@ -1786,7 +1793,7 @@
                 <w:rFonts w:ascii="Times New Roman" w:hAnsi="Times New Roman"/>
                 <w:b/>
                 <w:color w:val="000000"/>
-                <w:sz w:val="17"/>
+                <w:sz w:val="16"/>
               </w:rPr>
               <w:t>Stage</w:t>
             </w:r>
@@ -1794,7 +1801,7 @@
         </w:tc>
         <w:tc>
           <w:tcPr>
-            <w:tcW w:type="dxa" w:w="4514"/>
+            <w:tcW w:type="dxa" w:w="1728"/>
             <w:vAlign w:val="center"/>
             <w:shd w:fill="F2F4F4"/>
             <w:tcBorders>
@@ -1814,7 +1821,7 @@
                 <w:rFonts w:ascii="Times New Roman" w:hAnsi="Times New Roman"/>
                 <w:b/>
                 <w:color w:val="000000"/>
-                <w:sz w:val="17"/>
+                <w:sz w:val="16"/>
               </w:rPr>
               <w:t>Observations</w:t>
             </w:r>
@@ -1827,7 +1834,7 @@
         </w:trPr>
         <w:tc>
           <w:tcPr>
-            <w:tcW w:type="dxa" w:w="4514"/>
+            <w:tcW w:type="dxa" w:w="2448"/>
             <w:vAlign w:val="center"/>
             <w:tcBorders>
               <w:top w:val="none" w:sz="4" w:space="0" w:color="000000"/>
@@ -1845,7 +1852,7 @@
               <w:rPr>
                 <w:rFonts w:ascii="Times New Roman" w:hAnsi="Times New Roman"/>
                 <w:color w:val="000000"/>
-                <w:sz w:val="17"/>
+                <w:sz w:val="16"/>
               </w:rPr>
               <w:t>Source data</w:t>
             </w:r>
@@ -1853,7 +1860,7 @@
         </w:tc>
         <w:tc>
           <w:tcPr>
-            <w:tcW w:type="dxa" w:w="4514"/>
+            <w:tcW w:type="dxa" w:w="1728"/>
             <w:vAlign w:val="center"/>
             <w:tcBorders>
               <w:top w:val="none" w:sz="4" w:space="0" w:color="000000"/>
@@ -1871,7 +1878,7 @@
               <w:rPr>
                 <w:rFonts w:ascii="Times New Roman" w:hAnsi="Times New Roman"/>
                 <w:color w:val="000000"/>
-                <w:sz w:val="17"/>
+                <w:sz w:val="16"/>
               </w:rPr>
               <w:t>400</w:t>
             </w:r>
@@ -1884,7 +1891,7 @@
         </w:trPr>
         <w:tc>
           <w:tcPr>
-            <w:tcW w:type="dxa" w:w="4514"/>
+            <w:tcW w:type="dxa" w:w="2448"/>
             <w:vAlign w:val="center"/>
             <w:tcBorders>
               <w:top w:val="none" w:sz="4" w:space="0" w:color="000000"/>
@@ -1902,7 +1909,7 @@
               <w:rPr>
                 <w:rFonts w:ascii="Times New Roman" w:hAnsi="Times New Roman"/>
                 <w:color w:val="000000"/>
-                <w:sz w:val="17"/>
+                <w:sz w:val="16"/>
               </w:rPr>
               <w:t>Excluded: extreme values</w:t>
             </w:r>
@@ -1910,7 +1917,7 @@
         </w:tc>
         <w:tc>
           <w:tcPr>
-            <w:tcW w:type="dxa" w:w="4514"/>
+            <w:tcW w:type="dxa" w:w="1728"/>
             <w:vAlign w:val="center"/>
             <w:tcBorders>
               <w:top w:val="none" w:sz="4" w:space="0" w:color="000000"/>
@@ -1928,7 +1935,7 @@
               <w:rPr>
                 <w:rFonts w:ascii="Times New Roman" w:hAnsi="Times New Roman"/>
                 <w:color w:val="000000"/>
-                <w:sz w:val="17"/>
+                <w:sz w:val="16"/>
               </w:rPr>
               <w:t>22</w:t>
             </w:r>
@@ -1941,7 +1948,7 @@
         </w:trPr>
         <w:tc>
           <w:tcPr>
-            <w:tcW w:type="dxa" w:w="4514"/>
+            <w:tcW w:type="dxa" w:w="2448"/>
             <w:vAlign w:val="center"/>
             <w:tcBorders>
               <w:top w:val="none" w:sz="4" w:space="0" w:color="000000"/>
@@ -1959,7 +1966,7 @@
               <w:rPr>
                 <w:rFonts w:ascii="Times New Roman" w:hAnsi="Times New Roman"/>
                 <w:color w:val="000000"/>
-                <w:sz w:val="17"/>
+                <w:sz w:val="16"/>
               </w:rPr>
               <w:t>Excluded: &lt;2 unique alternatives</w:t>
             </w:r>
@@ -1967,7 +1974,7 @@
         </w:tc>
         <w:tc>
           <w:tcPr>
-            <w:tcW w:type="dxa" w:w="4514"/>
+            <w:tcW w:type="dxa" w:w="1728"/>
             <w:vAlign w:val="center"/>
             <w:tcBorders>
               <w:top w:val="none" w:sz="4" w:space="0" w:color="000000"/>
@@ -1985,7 +1992,7 @@
               <w:rPr>
                 <w:rFonts w:ascii="Times New Roman" w:hAnsi="Times New Roman"/>
                 <w:color w:val="000000"/>
-                <w:sz w:val="17"/>
+                <w:sz w:val="16"/>
               </w:rPr>
               <w:t>60</w:t>
             </w:r>
@@ -1998,7 +2005,7 @@
         </w:trPr>
         <w:tc>
           <w:tcPr>
-            <w:tcW w:type="dxa" w:w="4514"/>
+            <w:tcW w:type="dxa" w:w="2448"/>
             <w:vAlign w:val="center"/>
             <w:tcBorders>
               <w:top w:val="none" w:sz="4" w:space="0" w:color="000000"/>
@@ -2016,7 +2023,7 @@
               <w:rPr>
                 <w:rFonts w:ascii="Times New Roman" w:hAnsi="Times New Roman"/>
                 <w:color w:val="000000"/>
-                <w:sz w:val="17"/>
+                <w:sz w:val="16"/>
               </w:rPr>
               <w:t>Final analytical sample</w:t>
             </w:r>
@@ -2024,7 +2031,7 @@
         </w:tc>
         <w:tc>
           <w:tcPr>
-            <w:tcW w:type="dxa" w:w="4514"/>
+            <w:tcW w:type="dxa" w:w="1728"/>
             <w:vAlign w:val="center"/>
             <w:tcBorders>
               <w:top w:val="none" w:sz="4" w:space="0" w:color="000000"/>
@@ -2042,7 +2049,7 @@
               <w:rPr>
                 <w:rFonts w:ascii="Times New Roman" w:hAnsi="Times New Roman"/>
                 <w:color w:val="000000"/>
-                <w:sz w:val="17"/>
+                <w:sz w:val="16"/>
               </w:rPr>
               <w:t>318</w:t>
             </w:r>
@@ -2257,17 +2264,6 @@
     </w:p>
     <w:p>
       <w:pPr>
-        <w:sectPr>
-          <w:pgSz w:w="11909" w:h="16834"/>
-          <w:pgMar w:top="1440" w:right="1440" w:bottom="1440" w:left="1440" w:header="720" w:footer="720" w:gutter="0"/>
-          <w:docGrid w:linePitch="360"/>
-          <w:type w:val="continuous"/>
-          <w:cols w:num="2" w:space="708"/>
-        </w:sectPr>
-      </w:pPr>
-    </w:p>
-    <w:p>
-      <w:pPr>
         <w:keepNext/>
         <w:spacing w:before="160" w:after="40"/>
         <w:jc w:val="center"/>
@@ -2275,7 +2271,7 @@
       <w:r>
         <w:drawing>
           <wp:inline xmlns:a="http://schemas.openxmlformats.org/drawingml/2006/main" xmlns:pic="http://schemas.openxmlformats.org/drawingml/2006/picture">
-            <wp:extent cx="5486400" cy="3116341"/>
+            <wp:extent cx="2606040" cy="1480262"/>
             <wp:docPr id="2" name="Picture 2"/>
             <wp:cNvGraphicFramePr>
               <a:graphicFrameLocks noChangeAspect="1"/>
@@ -2296,7 +2292,7 @@
                   <pic:spPr>
                     <a:xfrm>
                       <a:off x="0" y="0"/>
-                      <a:ext cx="5486400" cy="3116341"/>
+                      <a:ext cx="2606040" cy="1480262"/>
                     </a:xfrm>
                     <a:prstGeom prst="rect"/>
                   </pic:spPr>
@@ -2309,6 +2305,7 @@
     </w:p>
     <w:p>
       <w:pPr>
+        <w:keepNext w:val="0"/>
         <w:spacing w:before="40" w:after="160"/>
         <w:jc w:val="center"/>
       </w:pPr>
@@ -2321,17 +2318,6 @@
         </w:rPr>
         <w:t>FIGURE 2. Choice distribution by mode group</w:t>
       </w:r>
-    </w:p>
-    <w:p>
-      <w:pPr>
-        <w:sectPr>
-          <w:pgSz w:w="11909" w:h="16834"/>
-          <w:pgMar w:top="1440" w:right="1440" w:bottom="1440" w:left="1440" w:header="720" w:footer="720" w:gutter="0"/>
-          <w:docGrid w:linePitch="360"/>
-          <w:type w:val="continuous"/>
-          <w:cols w:num="1" w:space="708"/>
-        </w:sectPr>
-      </w:pPr>
     </w:p>
     <w:p>
       <w:pPr>
@@ -2416,6 +2402,7 @@
     </w:p>
     <w:p>
       <w:pPr>
+        <w:keepNext w:val="0"/>
         <w:spacing w:before="40" w:after="160"/>
         <w:jc w:val="center"/>
       </w:pPr>
@@ -2458,6 +2445,7 @@
     </w:p>
     <w:p>
       <w:pPr>
+        <w:keepNext/>
         <w:spacing w:before="40" w:after="160"/>
         <w:jc w:val="center"/>
       </w:pPr>
@@ -2475,12 +2463,13 @@
       <w:tblPr>
         <w:tblW w:type="auto" w:w="0"/>
         <w:jc w:val="center"/>
+        <w:tblLayout w:type="fixed"/>
         <w:tblLook w:firstColumn="1" w:firstRow="1" w:lastColumn="0" w:lastRow="0" w:noHBand="0" w:noVBand="1" w:val="04A0"/>
       </w:tblPr>
       <w:tblGrid>
-        <w:gridCol w:w="3010"/>
-        <w:gridCol w:w="3010"/>
-        <w:gridCol w:w="3010"/>
+        <w:gridCol w:w="1440"/>
+        <w:gridCol w:w="1368"/>
+        <w:gridCol w:w="1368"/>
       </w:tblGrid>
       <w:tr>
         <w:trPr>
@@ -2488,7 +2477,7 @@
         </w:trPr>
         <w:tc>
           <w:tcPr>
-            <w:tcW w:type="dxa" w:w="3010"/>
+            <w:tcW w:type="dxa" w:w="1440"/>
             <w:vAlign w:val="center"/>
             <w:shd w:fill="F2F4F4"/>
             <w:tcBorders>
@@ -2508,7 +2497,7 @@
                 <w:rFonts w:ascii="Times New Roman" w:hAnsi="Times New Roman"/>
                 <w:b/>
                 <w:color w:val="000000"/>
-                <w:sz w:val="17"/>
+                <w:sz w:val="16"/>
               </w:rPr>
               <w:t>Variable</w:t>
             </w:r>
@@ -2516,7 +2505,7 @@
         </w:tc>
         <w:tc>
           <w:tcPr>
-            <w:tcW w:type="dxa" w:w="3010"/>
+            <w:tcW w:type="dxa" w:w="1368"/>
             <w:vAlign w:val="center"/>
             <w:shd w:fill="F2F4F4"/>
             <w:tcBorders>
@@ -2536,7 +2525,7 @@
                 <w:rFonts w:ascii="Times New Roman" w:hAnsi="Times New Roman"/>
                 <w:b/>
                 <w:color w:val="000000"/>
-                <w:sz w:val="17"/>
+                <w:sz w:val="16"/>
               </w:rPr>
               <w:t>Basic β (SE)</w:t>
             </w:r>
@@ -2544,7 +2533,7 @@
         </w:tc>
         <w:tc>
           <w:tcPr>
-            <w:tcW w:type="dxa" w:w="3010"/>
+            <w:tcW w:type="dxa" w:w="1368"/>
             <w:vAlign w:val="center"/>
             <w:shd w:fill="F2F4F4"/>
             <w:tcBorders>
@@ -2564,7 +2553,7 @@
                 <w:rFonts w:ascii="Times New Roman" w:hAnsi="Times New Roman"/>
                 <w:b/>
                 <w:color w:val="000000"/>
-                <w:sz w:val="17"/>
+                <w:sz w:val="16"/>
               </w:rPr>
               <w:t>MNL+ASC β (SE)</w:t>
             </w:r>
@@ -2577,7 +2566,7 @@
         </w:trPr>
         <w:tc>
           <w:tcPr>
-            <w:tcW w:type="dxa" w:w="3010"/>
+            <w:tcW w:type="dxa" w:w="1440"/>
             <w:vAlign w:val="center"/>
             <w:tcBorders>
               <w:top w:val="none" w:sz="4" w:space="0" w:color="000000"/>
@@ -2595,7 +2584,7 @@
               <w:rPr>
                 <w:rFonts w:ascii="Times New Roman" w:hAnsi="Times New Roman"/>
                 <w:color w:val="000000"/>
-                <w:sz w:val="17"/>
+                <w:sz w:val="16"/>
               </w:rPr>
               <w:t>Time</w:t>
             </w:r>
@@ -2603,7 +2592,7 @@
         </w:tc>
         <w:tc>
           <w:tcPr>
-            <w:tcW w:type="dxa" w:w="3010"/>
+            <w:tcW w:type="dxa" w:w="1368"/>
             <w:vAlign w:val="center"/>
             <w:tcBorders>
               <w:top w:val="none" w:sz="4" w:space="0" w:color="000000"/>
@@ -2621,7 +2610,7 @@
               <w:rPr>
                 <w:rFonts w:ascii="Times New Roman" w:hAnsi="Times New Roman"/>
                 <w:color w:val="000000"/>
-                <w:sz w:val="17"/>
+                <w:sz w:val="16"/>
               </w:rPr>
               <w:t>−0.00693 (0.00841)</w:t>
             </w:r>
@@ -2629,7 +2618,7 @@
         </w:tc>
         <w:tc>
           <w:tcPr>
-            <w:tcW w:type="dxa" w:w="3010"/>
+            <w:tcW w:type="dxa" w:w="1368"/>
             <w:vAlign w:val="center"/>
             <w:tcBorders>
               <w:top w:val="none" w:sz="4" w:space="0" w:color="000000"/>
@@ -2647,7 +2636,7 @@
               <w:rPr>
                 <w:rFonts w:ascii="Times New Roman" w:hAnsi="Times New Roman"/>
                 <w:color w:val="000000"/>
-                <w:sz w:val="17"/>
+                <w:sz w:val="16"/>
               </w:rPr>
               <w:t>−0.00239 (0.00861)</w:t>
             </w:r>
@@ -2660,7 +2649,7 @@
         </w:trPr>
         <w:tc>
           <w:tcPr>
-            <w:tcW w:type="dxa" w:w="3010"/>
+            <w:tcW w:type="dxa" w:w="1440"/>
             <w:vAlign w:val="center"/>
             <w:tcBorders>
               <w:top w:val="none" w:sz="4" w:space="0" w:color="000000"/>
@@ -2678,7 +2667,7 @@
               <w:rPr>
                 <w:rFonts w:ascii="Times New Roman" w:hAnsi="Times New Roman"/>
                 <w:color w:val="000000"/>
-                <w:sz w:val="17"/>
+                <w:sz w:val="16"/>
               </w:rPr>
               <w:t>Cost</w:t>
             </w:r>
@@ -2686,7 +2675,7 @@
         </w:tc>
         <w:tc>
           <w:tcPr>
-            <w:tcW w:type="dxa" w:w="3010"/>
+            <w:tcW w:type="dxa" w:w="1368"/>
             <w:vAlign w:val="center"/>
             <w:tcBorders>
               <w:top w:val="none" w:sz="4" w:space="0" w:color="000000"/>
@@ -2704,7 +2693,7 @@
               <w:rPr>
                 <w:rFonts w:ascii="Times New Roman" w:hAnsi="Times New Roman"/>
                 <w:color w:val="000000"/>
-                <w:sz w:val="17"/>
+                <w:sz w:val="16"/>
               </w:rPr>
               <w:t>−0.0000225 (0.0000174)</w:t>
             </w:r>
@@ -2712,7 +2701,7 @@
         </w:tc>
         <w:tc>
           <w:tcPr>
-            <w:tcW w:type="dxa" w:w="3010"/>
+            <w:tcW w:type="dxa" w:w="1368"/>
             <w:vAlign w:val="center"/>
             <w:tcBorders>
               <w:top w:val="none" w:sz="4" w:space="0" w:color="000000"/>
@@ -2730,7 +2719,7 @@
               <w:rPr>
                 <w:rFonts w:ascii="Times New Roman" w:hAnsi="Times New Roman"/>
                 <w:color w:val="000000"/>
-                <w:sz w:val="17"/>
+                <w:sz w:val="16"/>
               </w:rPr>
               <w:t>−0.0000211 (0.0000179)</w:t>
             </w:r>
@@ -2743,7 +2732,7 @@
         </w:trPr>
         <w:tc>
           <w:tcPr>
-            <w:tcW w:type="dxa" w:w="3010"/>
+            <w:tcW w:type="dxa" w:w="1440"/>
             <w:vAlign w:val="center"/>
             <w:tcBorders>
               <w:top w:val="none" w:sz="4" w:space="0" w:color="000000"/>
@@ -2761,7 +2750,7 @@
               <w:rPr>
                 <w:rFonts w:ascii="Times New Roman" w:hAnsi="Times New Roman"/>
                 <w:color w:val="000000"/>
-                <w:sz w:val="17"/>
+                <w:sz w:val="16"/>
               </w:rPr>
               <w:t>Transfers</w:t>
             </w:r>
@@ -2769,7 +2758,7 @@
         </w:tc>
         <w:tc>
           <w:tcPr>
-            <w:tcW w:type="dxa" w:w="3010"/>
+            <w:tcW w:type="dxa" w:w="1368"/>
             <w:vAlign w:val="center"/>
             <w:tcBorders>
               <w:top w:val="none" w:sz="4" w:space="0" w:color="000000"/>
@@ -2787,7 +2776,7 @@
               <w:rPr>
                 <w:rFonts w:ascii="Times New Roman" w:hAnsi="Times New Roman"/>
                 <w:color w:val="000000"/>
-                <w:sz w:val="17"/>
+                <w:sz w:val="16"/>
               </w:rPr>
               <w:t>0.240 (0.258)</w:t>
             </w:r>
@@ -2795,7 +2784,7 @@
         </w:tc>
         <w:tc>
           <w:tcPr>
-            <w:tcW w:type="dxa" w:w="3010"/>
+            <w:tcW w:type="dxa" w:w="1368"/>
             <w:vAlign w:val="center"/>
             <w:tcBorders>
               <w:top w:val="none" w:sz="4" w:space="0" w:color="000000"/>
@@ -2813,7 +2802,7 @@
               <w:rPr>
                 <w:rFonts w:ascii="Times New Roman" w:hAnsi="Times New Roman"/>
                 <w:color w:val="000000"/>
-                <w:sz w:val="17"/>
+                <w:sz w:val="16"/>
               </w:rPr>
               <w:t>0.231 (0.263)</w:t>
             </w:r>
@@ -2826,7 +2815,7 @@
         </w:trPr>
         <w:tc>
           <w:tcPr>
-            <w:tcW w:type="dxa" w:w="3010"/>
+            <w:tcW w:type="dxa" w:w="1440"/>
             <w:vAlign w:val="center"/>
             <w:tcBorders>
               <w:top w:val="none" w:sz="4" w:space="0" w:color="000000"/>
@@ -2844,7 +2833,7 @@
               <w:rPr>
                 <w:rFonts w:ascii="Times New Roman" w:hAnsi="Times New Roman"/>
                 <w:color w:val="000000"/>
-                <w:sz w:val="17"/>
+                <w:sz w:val="16"/>
               </w:rPr>
               <w:t>Access distance</w:t>
             </w:r>
@@ -2852,7 +2841,7 @@
         </w:tc>
         <w:tc>
           <w:tcPr>
-            <w:tcW w:type="dxa" w:w="3010"/>
+            <w:tcW w:type="dxa" w:w="1368"/>
             <w:vAlign w:val="center"/>
             <w:tcBorders>
               <w:top w:val="none" w:sz="4" w:space="0" w:color="000000"/>
@@ -2870,7 +2859,7 @@
               <w:rPr>
                 <w:rFonts w:ascii="Times New Roman" w:hAnsi="Times New Roman"/>
                 <w:color w:val="000000"/>
-                <w:sz w:val="17"/>
+                <w:sz w:val="16"/>
               </w:rPr>
               <w:t>0.336 (0.194)</w:t>
             </w:r>
@@ -2878,7 +2867,7 @@
         </w:tc>
         <w:tc>
           <w:tcPr>
-            <w:tcW w:type="dxa" w:w="3010"/>
+            <w:tcW w:type="dxa" w:w="1368"/>
             <w:vAlign w:val="center"/>
             <w:tcBorders>
               <w:top w:val="none" w:sz="4" w:space="0" w:color="000000"/>
@@ -2896,7 +2885,7 @@
               <w:rPr>
                 <w:rFonts w:ascii="Times New Roman" w:hAnsi="Times New Roman"/>
                 <w:color w:val="000000"/>
-                <w:sz w:val="17"/>
+                <w:sz w:val="16"/>
               </w:rPr>
               <w:t>0.502</w:t>
             </w:r>
@@ -2905,14 +2894,14 @@
                 <w:rFonts w:ascii="Times New Roman" w:hAnsi="Times New Roman"/>
                 <w:i/>
                 <w:color w:val="000000"/>
-                <w:sz w:val="17"/>
+                <w:sz w:val="16"/>
               </w:rPr>
             </w:r>
             <w:r>
               <w:rPr>
                 <w:rFonts w:ascii="Times New Roman" w:hAnsi="Times New Roman"/>
                 <w:color w:val="000000"/>
-                <w:sz w:val="17"/>
+                <w:sz w:val="16"/>
               </w:rPr>
               <w:t xml:space="preserve"> (0.214)</w:t>
             </w:r>
@@ -2925,7 +2914,7 @@
         </w:trPr>
         <w:tc>
           <w:tcPr>
-            <w:tcW w:type="dxa" w:w="3010"/>
+            <w:tcW w:type="dxa" w:w="1440"/>
             <w:vAlign w:val="center"/>
             <w:tcBorders>
               <w:top w:val="none" w:sz="4" w:space="0" w:color="000000"/>
@@ -2943,7 +2932,7 @@
               <w:rPr>
                 <w:rFonts w:ascii="Times New Roman" w:hAnsi="Times New Roman"/>
                 <w:color w:val="000000"/>
-                <w:sz w:val="17"/>
+                <w:sz w:val="16"/>
               </w:rPr>
               <w:t>Comfort</w:t>
             </w:r>
@@ -2951,7 +2940,7 @@
         </w:tc>
         <w:tc>
           <w:tcPr>
-            <w:tcW w:type="dxa" w:w="3010"/>
+            <w:tcW w:type="dxa" w:w="1368"/>
             <w:vAlign w:val="center"/>
             <w:tcBorders>
               <w:top w:val="none" w:sz="4" w:space="0" w:color="000000"/>
@@ -2969,7 +2958,7 @@
               <w:rPr>
                 <w:rFonts w:ascii="Times New Roman" w:hAnsi="Times New Roman"/>
                 <w:color w:val="000000"/>
-                <w:sz w:val="17"/>
+                <w:sz w:val="16"/>
               </w:rPr>
               <w:t>0.413</w:t>
             </w:r>
@@ -2978,14 +2967,14 @@
                 <w:rFonts w:ascii="Times New Roman" w:hAnsi="Times New Roman"/>
                 <w:i/>
                 <w:color w:val="000000"/>
-                <w:sz w:val="17"/>
+                <w:sz w:val="16"/>
               </w:rPr>
             </w:r>
             <w:r>
               <w:rPr>
                 <w:rFonts w:ascii="Times New Roman" w:hAnsi="Times New Roman"/>
                 <w:color w:val="000000"/>
-                <w:sz w:val="17"/>
+                <w:sz w:val="16"/>
               </w:rPr>
               <w:t xml:space="preserve"> (0.164)</w:t>
             </w:r>
@@ -2993,7 +2982,7 @@
         </w:tc>
         <w:tc>
           <w:tcPr>
-            <w:tcW w:type="dxa" w:w="3010"/>
+            <w:tcW w:type="dxa" w:w="1368"/>
             <w:vAlign w:val="center"/>
             <w:tcBorders>
               <w:top w:val="none" w:sz="4" w:space="0" w:color="000000"/>
@@ -3011,7 +3000,7 @@
               <w:rPr>
                 <w:rFonts w:ascii="Times New Roman" w:hAnsi="Times New Roman"/>
                 <w:color w:val="000000"/>
-                <w:sz w:val="17"/>
+                <w:sz w:val="16"/>
               </w:rPr>
               <w:t>0.255 (0.174)</w:t>
             </w:r>
@@ -3024,7 +3013,7 @@
         </w:trPr>
         <w:tc>
           <w:tcPr>
-            <w:tcW w:type="dxa" w:w="3010"/>
+            <w:tcW w:type="dxa" w:w="1440"/>
             <w:vAlign w:val="center"/>
             <w:tcBorders>
               <w:top w:val="none" w:sz="4" w:space="0" w:color="000000"/>
@@ -3042,7 +3031,7 @@
               <w:rPr>
                 <w:rFonts w:ascii="Times New Roman" w:hAnsi="Times New Roman"/>
                 <w:color w:val="000000"/>
-                <w:sz w:val="17"/>
+                <w:sz w:val="16"/>
               </w:rPr>
               <w:t>Reliability</w:t>
             </w:r>
@@ -3050,7 +3039,7 @@
         </w:tc>
         <w:tc>
           <w:tcPr>
-            <w:tcW w:type="dxa" w:w="3010"/>
+            <w:tcW w:type="dxa" w:w="1368"/>
             <w:vAlign w:val="center"/>
             <w:tcBorders>
               <w:top w:val="none" w:sz="4" w:space="0" w:color="000000"/>
@@ -3068,7 +3057,7 @@
               <w:rPr>
                 <w:rFonts w:ascii="Times New Roman" w:hAnsi="Times New Roman"/>
                 <w:color w:val="000000"/>
-                <w:sz w:val="17"/>
+                <w:sz w:val="16"/>
               </w:rPr>
               <w:t>0.118 (0.132)</w:t>
             </w:r>
@@ -3076,7 +3065,7 @@
         </w:tc>
         <w:tc>
           <w:tcPr>
-            <w:tcW w:type="dxa" w:w="3010"/>
+            <w:tcW w:type="dxa" w:w="1368"/>
             <w:vAlign w:val="center"/>
             <w:tcBorders>
               <w:top w:val="none" w:sz="4" w:space="0" w:color="000000"/>
@@ -3094,7 +3083,7 @@
               <w:rPr>
                 <w:rFonts w:ascii="Times New Roman" w:hAnsi="Times New Roman"/>
                 <w:color w:val="000000"/>
-                <w:sz w:val="17"/>
+                <w:sz w:val="16"/>
               </w:rPr>
               <w:t>0.353</w:t>
             </w:r>
@@ -3103,14 +3092,14 @@
                 <w:rFonts w:ascii="Times New Roman" w:hAnsi="Times New Roman"/>
                 <w:i/>
                 <w:color w:val="000000"/>
-                <w:sz w:val="17"/>
+                <w:sz w:val="16"/>
               </w:rPr>
             </w:r>
             <w:r>
               <w:rPr>
                 <w:rFonts w:ascii="Times New Roman" w:hAnsi="Times New Roman"/>
                 <w:color w:val="000000"/>
-                <w:sz w:val="17"/>
+                <w:sz w:val="16"/>
               </w:rPr>
               <w:t xml:space="preserve"> (0.166)</w:t>
             </w:r>
@@ -3123,7 +3112,7 @@
         </w:trPr>
         <w:tc>
           <w:tcPr>
-            <w:tcW w:type="dxa" w:w="3010"/>
+            <w:tcW w:type="dxa" w:w="1440"/>
             <w:vAlign w:val="center"/>
             <w:tcBorders>
               <w:top w:val="none" w:sz="4" w:space="0" w:color="000000"/>
@@ -3141,7 +3130,7 @@
               <w:rPr>
                 <w:rFonts w:ascii="Times New Roman" w:hAnsi="Times New Roman"/>
                 <w:color w:val="000000"/>
-                <w:sz w:val="17"/>
+                <w:sz w:val="16"/>
               </w:rPr>
               <w:t>Private-vehicle ASC</w:t>
             </w:r>
@@ -3149,7 +3138,7 @@
         </w:tc>
         <w:tc>
           <w:tcPr>
-            <w:tcW w:type="dxa" w:w="3010"/>
+            <w:tcW w:type="dxa" w:w="1368"/>
             <w:vAlign w:val="center"/>
             <w:tcBorders>
               <w:top w:val="none" w:sz="4" w:space="0" w:color="000000"/>
@@ -3167,7 +3156,7 @@
               <w:rPr>
                 <w:rFonts w:ascii="Times New Roman" w:hAnsi="Times New Roman"/>
                 <w:color w:val="000000"/>
-                <w:sz w:val="17"/>
+                <w:sz w:val="16"/>
               </w:rPr>
               <w:t>—</w:t>
             </w:r>
@@ -3175,7 +3164,7 @@
         </w:tc>
         <w:tc>
           <w:tcPr>
-            <w:tcW w:type="dxa" w:w="3010"/>
+            <w:tcW w:type="dxa" w:w="1368"/>
             <w:vAlign w:val="center"/>
             <w:tcBorders>
               <w:top w:val="none" w:sz="4" w:space="0" w:color="000000"/>
@@ -3193,7 +3182,7 @@
               <w:rPr>
                 <w:rFonts w:ascii="Times New Roman" w:hAnsi="Times New Roman"/>
                 <w:color w:val="000000"/>
-                <w:sz w:val="17"/>
+                <w:sz w:val="16"/>
               </w:rPr>
               <w:t>0.610</w:t>
             </w:r>
@@ -3202,14 +3191,14 @@
                 <w:rFonts w:ascii="Times New Roman" w:hAnsi="Times New Roman"/>
                 <w:i/>
                 <w:color w:val="000000"/>
-                <w:sz w:val="17"/>
+                <w:sz w:val="16"/>
               </w:rPr>
             </w:r>
             <w:r>
               <w:rPr>
                 <w:rFonts w:ascii="Times New Roman" w:hAnsi="Times New Roman"/>
                 <w:color w:val="000000"/>
-                <w:sz w:val="17"/>
+                <w:sz w:val="16"/>
               </w:rPr>
               <w:t xml:space="preserve"> (0.247)</w:t>
             </w:r>
@@ -3222,7 +3211,7 @@
         </w:trPr>
         <w:tc>
           <w:tcPr>
-            <w:tcW w:type="dxa" w:w="3010"/>
+            <w:tcW w:type="dxa" w:w="1440"/>
             <w:vAlign w:val="center"/>
             <w:tcBorders>
               <w:top w:val="none" w:sz="4" w:space="0" w:color="000000"/>
@@ -3240,7 +3229,7 @@
               <w:rPr>
                 <w:rFonts w:ascii="Times New Roman" w:hAnsi="Times New Roman"/>
                 <w:color w:val="000000"/>
-                <w:sz w:val="17"/>
+                <w:sz w:val="16"/>
               </w:rPr>
               <w:t>Log-likelihood</w:t>
             </w:r>
@@ -3248,7 +3237,7 @@
         </w:tc>
         <w:tc>
           <w:tcPr>
-            <w:tcW w:type="dxa" w:w="3010"/>
+            <w:tcW w:type="dxa" w:w="1368"/>
             <w:vAlign w:val="center"/>
             <w:tcBorders>
               <w:top w:val="none" w:sz="4" w:space="0" w:color="000000"/>
@@ -3266,7 +3255,7 @@
               <w:rPr>
                 <w:rFonts w:ascii="Times New Roman" w:hAnsi="Times New Roman"/>
                 <w:color w:val="000000"/>
-                <w:sz w:val="17"/>
+                <w:sz w:val="16"/>
               </w:rPr>
               <w:t>−255.166</w:t>
             </w:r>
@@ -3274,7 +3263,7 @@
         </w:tc>
         <w:tc>
           <w:tcPr>
-            <w:tcW w:type="dxa" w:w="3010"/>
+            <w:tcW w:type="dxa" w:w="1368"/>
             <w:vAlign w:val="center"/>
             <w:tcBorders>
               <w:top w:val="none" w:sz="4" w:space="0" w:color="000000"/>
@@ -3292,7 +3281,7 @@
               <w:rPr>
                 <w:rFonts w:ascii="Times New Roman" w:hAnsi="Times New Roman"/>
                 <w:color w:val="000000"/>
-                <w:sz w:val="17"/>
+                <w:sz w:val="16"/>
               </w:rPr>
               <w:t>−252.049</w:t>
             </w:r>
@@ -3305,7 +3294,7 @@
         </w:trPr>
         <w:tc>
           <w:tcPr>
-            <w:tcW w:type="dxa" w:w="3010"/>
+            <w:tcW w:type="dxa" w:w="1440"/>
             <w:vAlign w:val="center"/>
             <w:tcBorders>
               <w:top w:val="none" w:sz="4" w:space="0" w:color="000000"/>
@@ -3323,7 +3312,7 @@
               <w:rPr>
                 <w:rFonts w:ascii="Times New Roman" w:hAnsi="Times New Roman"/>
                 <w:color w:val="000000"/>
-                <w:sz w:val="17"/>
+                <w:sz w:val="16"/>
               </w:rPr>
               <w:t>McFadden ρ²</w:t>
             </w:r>
@@ -3331,7 +3320,7 @@
         </w:tc>
         <w:tc>
           <w:tcPr>
-            <w:tcW w:type="dxa" w:w="3010"/>
+            <w:tcW w:type="dxa" w:w="1368"/>
             <w:vAlign w:val="center"/>
             <w:tcBorders>
               <w:top w:val="none" w:sz="4" w:space="0" w:color="000000"/>
@@ -3349,7 +3338,7 @@
               <w:rPr>
                 <w:rFonts w:ascii="Times New Roman" w:hAnsi="Times New Roman"/>
                 <w:color w:val="000000"/>
-                <w:sz w:val="17"/>
+                <w:sz w:val="16"/>
               </w:rPr>
               <w:t>0.0397</w:t>
             </w:r>
@@ -3357,7 +3346,7 @@
         </w:tc>
         <w:tc>
           <w:tcPr>
-            <w:tcW w:type="dxa" w:w="3010"/>
+            <w:tcW w:type="dxa" w:w="1368"/>
             <w:vAlign w:val="center"/>
             <w:tcBorders>
               <w:top w:val="none" w:sz="4" w:space="0" w:color="000000"/>
@@ -3375,7 +3364,7 @@
               <w:rPr>
                 <w:rFonts w:ascii="Times New Roman" w:hAnsi="Times New Roman"/>
                 <w:color w:val="000000"/>
-                <w:sz w:val="17"/>
+                <w:sz w:val="16"/>
               </w:rPr>
               <w:t>0.0514</w:t>
             </w:r>
@@ -3388,7 +3377,7 @@
         </w:trPr>
         <w:tc>
           <w:tcPr>
-            <w:tcW w:type="dxa" w:w="3010"/>
+            <w:tcW w:type="dxa" w:w="1440"/>
             <w:vAlign w:val="center"/>
             <w:tcBorders>
               <w:top w:val="none" w:sz="4" w:space="0" w:color="000000"/>
@@ -3406,7 +3395,7 @@
               <w:rPr>
                 <w:rFonts w:ascii="Times New Roman" w:hAnsi="Times New Roman"/>
                 <w:color w:val="000000"/>
-                <w:sz w:val="17"/>
+                <w:sz w:val="16"/>
               </w:rPr>
               <w:t>AIC</w:t>
             </w:r>
@@ -3414,7 +3403,7 @@
         </w:tc>
         <w:tc>
           <w:tcPr>
-            <w:tcW w:type="dxa" w:w="3010"/>
+            <w:tcW w:type="dxa" w:w="1368"/>
             <w:vAlign w:val="center"/>
             <w:tcBorders>
               <w:top w:val="none" w:sz="4" w:space="0" w:color="000000"/>
@@ -3432,7 +3421,7 @@
               <w:rPr>
                 <w:rFonts w:ascii="Times New Roman" w:hAnsi="Times New Roman"/>
                 <w:color w:val="000000"/>
-                <w:sz w:val="17"/>
+                <w:sz w:val="16"/>
               </w:rPr>
               <w:t>522.33</w:t>
             </w:r>
@@ -3440,7 +3429,7 @@
         </w:tc>
         <w:tc>
           <w:tcPr>
-            <w:tcW w:type="dxa" w:w="3010"/>
+            <w:tcW w:type="dxa" w:w="1368"/>
             <w:vAlign w:val="center"/>
             <w:tcBorders>
               <w:top w:val="none" w:sz="4" w:space="0" w:color="000000"/>
@@ -3458,7 +3447,7 @@
               <w:rPr>
                 <w:rFonts w:ascii="Times New Roman" w:hAnsi="Times New Roman"/>
                 <w:color w:val="000000"/>
-                <w:sz w:val="17"/>
+                <w:sz w:val="16"/>
               </w:rPr>
               <w:t>518.10</w:t>
             </w:r>
@@ -3471,7 +3460,7 @@
         </w:trPr>
         <w:tc>
           <w:tcPr>
-            <w:tcW w:type="dxa" w:w="3010"/>
+            <w:tcW w:type="dxa" w:w="1440"/>
             <w:vAlign w:val="center"/>
             <w:tcBorders>
               <w:top w:val="none" w:sz="4" w:space="0" w:color="000000"/>
@@ -3489,7 +3478,7 @@
               <w:rPr>
                 <w:rFonts w:ascii="Times New Roman" w:hAnsi="Times New Roman"/>
                 <w:color w:val="000000"/>
-                <w:sz w:val="17"/>
+                <w:sz w:val="16"/>
               </w:rPr>
               <w:t>BIC</w:t>
             </w:r>
@@ -3497,7 +3486,7 @@
         </w:tc>
         <w:tc>
           <w:tcPr>
-            <w:tcW w:type="dxa" w:w="3010"/>
+            <w:tcW w:type="dxa" w:w="1368"/>
             <w:vAlign w:val="center"/>
             <w:tcBorders>
               <w:top w:val="none" w:sz="4" w:space="0" w:color="000000"/>
@@ -3515,7 +3504,7 @@
               <w:rPr>
                 <w:rFonts w:ascii="Times New Roman" w:hAnsi="Times New Roman"/>
                 <w:color w:val="000000"/>
-                <w:sz w:val="17"/>
+                <w:sz w:val="16"/>
               </w:rPr>
               <w:t>544.91</w:t>
             </w:r>
@@ -3523,7 +3512,7 @@
         </w:tc>
         <w:tc>
           <w:tcPr>
-            <w:tcW w:type="dxa" w:w="3010"/>
+            <w:tcW w:type="dxa" w:w="1368"/>
             <w:vAlign w:val="center"/>
             <w:tcBorders>
               <w:top w:val="none" w:sz="4" w:space="0" w:color="000000"/>
@@ -3541,7 +3530,7 @@
               <w:rPr>
                 <w:rFonts w:ascii="Times New Roman" w:hAnsi="Times New Roman"/>
                 <w:color w:val="000000"/>
-                <w:sz w:val="17"/>
+                <w:sz w:val="16"/>
               </w:rPr>
               <w:t>544.43</w:t>
             </w:r>
@@ -3627,17 +3616,6 @@
     </w:p>
     <w:p>
       <w:pPr>
-        <w:sectPr>
-          <w:pgSz w:w="11909" w:h="16834"/>
-          <w:pgMar w:top="1440" w:right="1440" w:bottom="1440" w:left="1440" w:header="720" w:footer="720" w:gutter="0"/>
-          <w:docGrid w:linePitch="360"/>
-          <w:type w:val="continuous"/>
-          <w:cols w:num="2" w:space="708"/>
-        </w:sectPr>
-      </w:pPr>
-    </w:p>
-    <w:p>
-      <w:pPr>
         <w:keepNext/>
         <w:spacing w:before="160" w:after="40"/>
         <w:jc w:val="center"/>
@@ -3645,7 +3623,7 @@
       <w:r>
         <w:drawing>
           <wp:inline xmlns:a="http://schemas.openxmlformats.org/drawingml/2006/main" xmlns:pic="http://schemas.openxmlformats.org/drawingml/2006/picture">
-            <wp:extent cx="5486400" cy="3608395"/>
+            <wp:extent cx="2606040" cy="1713987"/>
             <wp:docPr id="4" name="Picture 4"/>
             <wp:cNvGraphicFramePr>
               <a:graphicFrameLocks noChangeAspect="1"/>
@@ -3666,7 +3644,7 @@
                   <pic:spPr>
                     <a:xfrm>
                       <a:off x="0" y="0"/>
-                      <a:ext cx="5486400" cy="3608395"/>
+                      <a:ext cx="2606040" cy="1713987"/>
                     </a:xfrm>
                     <a:prstGeom prst="rect"/>
                   </pic:spPr>
@@ -3679,6 +3657,7 @@
     </w:p>
     <w:p>
       <w:pPr>
+        <w:keepNext w:val="0"/>
         <w:spacing w:before="40" w:after="160"/>
         <w:jc w:val="center"/>
       </w:pPr>
@@ -3691,17 +3670,6 @@
         </w:rPr>
         <w:t>FIGURE 4. MNL+ASC coefficients and 95% confidence intervals</w:t>
       </w:r>
-    </w:p>
-    <w:p>
-      <w:pPr>
-        <w:sectPr>
-          <w:pgSz w:w="11909" w:h="16834"/>
-          <w:pgMar w:top="1440" w:right="1440" w:bottom="1440" w:left="1440" w:header="720" w:footer="720" w:gutter="0"/>
-          <w:docGrid w:linePitch="360"/>
-          <w:type w:val="continuous"/>
-          <w:cols w:num="1" w:space="708"/>
-        </w:sectPr>
-      </w:pPr>
     </w:p>
     <w:p>
       <w:pPr>
@@ -3721,6 +3689,7 @@
     </w:p>
     <w:p>
       <w:pPr>
+        <w:keepNext/>
         <w:spacing w:before="40" w:after="160"/>
         <w:jc w:val="center"/>
       </w:pPr>
@@ -3749,15 +3718,16 @@
       <w:tblPr>
         <w:tblW w:type="auto" w:w="0"/>
         <w:jc w:val="center"/>
+        <w:tblLayout w:type="fixed"/>
         <w:tblLook w:firstColumn="1" w:firstRow="1" w:lastColumn="0" w:lastRow="0" w:noHBand="0" w:noVBand="1" w:val="04A0"/>
       </w:tblPr>
       <w:tblGrid>
-        <w:gridCol w:w="1505"/>
-        <w:gridCol w:w="1505"/>
-        <w:gridCol w:w="1505"/>
-        <w:gridCol w:w="1505"/>
-        <w:gridCol w:w="1505"/>
-        <w:gridCol w:w="1505"/>
+        <w:gridCol w:w="2117"/>
+        <w:gridCol w:w="1368"/>
+        <w:gridCol w:w="1224"/>
+        <w:gridCol w:w="1368"/>
+        <w:gridCol w:w="1368"/>
+        <w:gridCol w:w="1584"/>
       </w:tblGrid>
       <w:tr>
         <w:trPr>
@@ -3765,7 +3735,7 @@
         </w:trPr>
         <w:tc>
           <w:tcPr>
-            <w:tcW w:type="dxa" w:w="1505"/>
+            <w:tcW w:type="dxa" w:w="2117"/>
             <w:vAlign w:val="center"/>
             <w:shd w:fill="F2F4F4"/>
             <w:tcBorders>
@@ -3785,7 +3755,7 @@
                 <w:rFonts w:ascii="Times New Roman" w:hAnsi="Times New Roman"/>
                 <w:b/>
                 <w:color w:val="000000"/>
-                <w:sz w:val="16"/>
+                <w:sz w:val="15"/>
               </w:rPr>
               <w:t>Specification</w:t>
             </w:r>
@@ -3793,7 +3763,7 @@
         </w:tc>
         <w:tc>
           <w:tcPr>
-            <w:tcW w:type="dxa" w:w="1505"/>
+            <w:tcW w:type="dxa" w:w="1368"/>
             <w:vAlign w:val="center"/>
             <w:shd w:fill="F2F4F4"/>
             <w:tcBorders>
@@ -3813,7 +3783,7 @@
                 <w:rFonts w:ascii="Times New Roman" w:hAnsi="Times New Roman"/>
                 <w:b/>
                 <w:color w:val="000000"/>
-                <w:sz w:val="16"/>
+                <w:sz w:val="15"/>
               </w:rPr>
               <w:t>LL</w:t>
             </w:r>
@@ -3821,7 +3791,7 @@
         </w:tc>
         <w:tc>
           <w:tcPr>
-            <w:tcW w:type="dxa" w:w="1505"/>
+            <w:tcW w:type="dxa" w:w="1224"/>
             <w:vAlign w:val="center"/>
             <w:shd w:fill="F2F4F4"/>
             <w:tcBorders>
@@ -3841,7 +3811,7 @@
                 <w:rFonts w:ascii="Times New Roman" w:hAnsi="Times New Roman"/>
                 <w:b/>
                 <w:color w:val="000000"/>
-                <w:sz w:val="16"/>
+                <w:sz w:val="15"/>
               </w:rPr>
               <w:t>ρ²</w:t>
             </w:r>
@@ -3849,7 +3819,7 @@
         </w:tc>
         <w:tc>
           <w:tcPr>
-            <w:tcW w:type="dxa" w:w="1505"/>
+            <w:tcW w:type="dxa" w:w="1368"/>
             <w:vAlign w:val="center"/>
             <w:shd w:fill="F2F4F4"/>
             <w:tcBorders>
@@ -3869,7 +3839,7 @@
                 <w:rFonts w:ascii="Times New Roman" w:hAnsi="Times New Roman"/>
                 <w:b/>
                 <w:color w:val="000000"/>
-                <w:sz w:val="16"/>
+                <w:sz w:val="15"/>
               </w:rPr>
               <w:t>AIC</w:t>
             </w:r>
@@ -3877,7 +3847,7 @@
         </w:tc>
         <w:tc>
           <w:tcPr>
-            <w:tcW w:type="dxa" w:w="1505"/>
+            <w:tcW w:type="dxa" w:w="1368"/>
             <w:vAlign w:val="center"/>
             <w:shd w:fill="F2F4F4"/>
             <w:tcBorders>
@@ -3897,7 +3867,7 @@
                 <w:rFonts w:ascii="Times New Roman" w:hAnsi="Times New Roman"/>
                 <w:b/>
                 <w:color w:val="000000"/>
-                <w:sz w:val="16"/>
+                <w:sz w:val="15"/>
               </w:rPr>
               <w:t>BIC</w:t>
             </w:r>
@@ -3905,7 +3875,7 @@
         </w:tc>
         <w:tc>
           <w:tcPr>
-            <w:tcW w:type="dxa" w:w="1505"/>
+            <w:tcW w:type="dxa" w:w="1584"/>
             <w:vAlign w:val="center"/>
             <w:shd w:fill="F2F4F4"/>
             <w:tcBorders>
@@ -3925,7 +3895,7 @@
                 <w:rFonts w:ascii="Times New Roman" w:hAnsi="Times New Roman"/>
                 <w:b/>
                 <w:color w:val="000000"/>
-                <w:sz w:val="16"/>
+                <w:sz w:val="15"/>
               </w:rPr>
               <w:t>LR p-value</w:t>
             </w:r>
@@ -3938,7 +3908,7 @@
         </w:trPr>
         <w:tc>
           <w:tcPr>
-            <w:tcW w:type="dxa" w:w="1505"/>
+            <w:tcW w:type="dxa" w:w="2117"/>
             <w:vAlign w:val="center"/>
             <w:tcBorders>
               <w:top w:val="none" w:sz="4" w:space="0" w:color="000000"/>
@@ -3956,7 +3926,7 @@
               <w:rPr>
                 <w:rFonts w:ascii="Times New Roman" w:hAnsi="Times New Roman"/>
                 <w:color w:val="000000"/>
-                <w:sz w:val="16"/>
+                <w:sz w:val="15"/>
               </w:rPr>
               <w:t>Full + ASC</w:t>
             </w:r>
@@ -3964,7 +3934,7 @@
         </w:tc>
         <w:tc>
           <w:tcPr>
-            <w:tcW w:type="dxa" w:w="1505"/>
+            <w:tcW w:type="dxa" w:w="1368"/>
             <w:vAlign w:val="center"/>
             <w:tcBorders>
               <w:top w:val="none" w:sz="4" w:space="0" w:color="000000"/>
@@ -3982,7 +3952,7 @@
               <w:rPr>
                 <w:rFonts w:ascii="Times New Roman" w:hAnsi="Times New Roman"/>
                 <w:color w:val="000000"/>
-                <w:sz w:val="16"/>
+                <w:sz w:val="15"/>
               </w:rPr>
               <w:t>−252.049</w:t>
             </w:r>
@@ -3990,7 +3960,7 @@
         </w:tc>
         <w:tc>
           <w:tcPr>
-            <w:tcW w:type="dxa" w:w="1505"/>
+            <w:tcW w:type="dxa" w:w="1224"/>
             <w:vAlign w:val="center"/>
             <w:tcBorders>
               <w:top w:val="none" w:sz="4" w:space="0" w:color="000000"/>
@@ -4008,7 +3978,7 @@
               <w:rPr>
                 <w:rFonts w:ascii="Times New Roman" w:hAnsi="Times New Roman"/>
                 <w:color w:val="000000"/>
-                <w:sz w:val="16"/>
+                <w:sz w:val="15"/>
               </w:rPr>
               <w:t>0.0514</w:t>
             </w:r>
@@ -4016,7 +3986,7 @@
         </w:tc>
         <w:tc>
           <w:tcPr>
-            <w:tcW w:type="dxa" w:w="1505"/>
+            <w:tcW w:type="dxa" w:w="1368"/>
             <w:vAlign w:val="center"/>
             <w:tcBorders>
               <w:top w:val="none" w:sz="4" w:space="0" w:color="000000"/>
@@ -4034,7 +4004,7 @@
               <w:rPr>
                 <w:rFonts w:ascii="Times New Roman" w:hAnsi="Times New Roman"/>
                 <w:color w:val="000000"/>
-                <w:sz w:val="16"/>
+                <w:sz w:val="15"/>
               </w:rPr>
               <w:t>518.10</w:t>
             </w:r>
@@ -4042,7 +4012,7 @@
         </w:tc>
         <w:tc>
           <w:tcPr>
-            <w:tcW w:type="dxa" w:w="1505"/>
+            <w:tcW w:type="dxa" w:w="1368"/>
             <w:vAlign w:val="center"/>
             <w:tcBorders>
               <w:top w:val="none" w:sz="4" w:space="0" w:color="000000"/>
@@ -4060,7 +4030,7 @@
               <w:rPr>
                 <w:rFonts w:ascii="Times New Roman" w:hAnsi="Times New Roman"/>
                 <w:color w:val="000000"/>
-                <w:sz w:val="16"/>
+                <w:sz w:val="15"/>
               </w:rPr>
               <w:t>544.43</w:t>
             </w:r>
@@ -4068,7 +4038,7 @@
         </w:tc>
         <w:tc>
           <w:tcPr>
-            <w:tcW w:type="dxa" w:w="1505"/>
+            <w:tcW w:type="dxa" w:w="1584"/>
             <w:vAlign w:val="center"/>
             <w:tcBorders>
               <w:top w:val="none" w:sz="4" w:space="0" w:color="000000"/>
@@ -4086,7 +4056,7 @@
               <w:rPr>
                 <w:rFonts w:ascii="Times New Roman" w:hAnsi="Times New Roman"/>
                 <w:color w:val="000000"/>
-                <w:sz w:val="16"/>
+                <w:sz w:val="15"/>
               </w:rPr>
               <w:t>—</w:t>
             </w:r>
@@ -4099,7 +4069,7 @@
         </w:trPr>
         <w:tc>
           <w:tcPr>
-            <w:tcW w:type="dxa" w:w="1505"/>
+            <w:tcW w:type="dxa" w:w="2117"/>
             <w:vAlign w:val="center"/>
             <w:tcBorders>
               <w:top w:val="none" w:sz="4" w:space="0" w:color="000000"/>
@@ -4117,7 +4087,7 @@
               <w:rPr>
                 <w:rFonts w:ascii="Times New Roman" w:hAnsi="Times New Roman"/>
                 <w:color w:val="000000"/>
-                <w:sz w:val="16"/>
+                <w:sz w:val="15"/>
               </w:rPr>
               <w:t>Without access</w:t>
             </w:r>
@@ -4125,7 +4095,7 @@
         </w:tc>
         <w:tc>
           <w:tcPr>
-            <w:tcW w:type="dxa" w:w="1505"/>
+            <w:tcW w:type="dxa" w:w="1368"/>
             <w:vAlign w:val="center"/>
             <w:tcBorders>
               <w:top w:val="none" w:sz="4" w:space="0" w:color="000000"/>
@@ -4143,7 +4113,7 @@
               <w:rPr>
                 <w:rFonts w:ascii="Times New Roman" w:hAnsi="Times New Roman"/>
                 <w:color w:val="000000"/>
-                <w:sz w:val="16"/>
+                <w:sz w:val="15"/>
               </w:rPr>
               <w:t>−255.122</w:t>
             </w:r>
@@ -4151,7 +4121,7 @@
         </w:tc>
         <w:tc>
           <w:tcPr>
-            <w:tcW w:type="dxa" w:w="1505"/>
+            <w:tcW w:type="dxa" w:w="1224"/>
             <w:vAlign w:val="center"/>
             <w:tcBorders>
               <w:top w:val="none" w:sz="4" w:space="0" w:color="000000"/>
@@ -4169,7 +4139,7 @@
               <w:rPr>
                 <w:rFonts w:ascii="Times New Roman" w:hAnsi="Times New Roman"/>
                 <w:color w:val="000000"/>
-                <w:sz w:val="16"/>
+                <w:sz w:val="15"/>
               </w:rPr>
               <w:t>0.0399</w:t>
             </w:r>
@@ -4177,7 +4147,7 @@
         </w:tc>
         <w:tc>
           <w:tcPr>
-            <w:tcW w:type="dxa" w:w="1505"/>
+            <w:tcW w:type="dxa" w:w="1368"/>
             <w:vAlign w:val="center"/>
             <w:tcBorders>
               <w:top w:val="none" w:sz="4" w:space="0" w:color="000000"/>
@@ -4195,7 +4165,7 @@
               <w:rPr>
                 <w:rFonts w:ascii="Times New Roman" w:hAnsi="Times New Roman"/>
                 <w:color w:val="000000"/>
-                <w:sz w:val="16"/>
+                <w:sz w:val="15"/>
               </w:rPr>
               <w:t>522.24</w:t>
             </w:r>
@@ -4203,7 +4173,7 @@
         </w:tc>
         <w:tc>
           <w:tcPr>
-            <w:tcW w:type="dxa" w:w="1505"/>
+            <w:tcW w:type="dxa" w:w="1368"/>
             <w:vAlign w:val="center"/>
             <w:tcBorders>
               <w:top w:val="none" w:sz="4" w:space="0" w:color="000000"/>
@@ -4221,7 +4191,7 @@
               <w:rPr>
                 <w:rFonts w:ascii="Times New Roman" w:hAnsi="Times New Roman"/>
                 <w:color w:val="000000"/>
-                <w:sz w:val="16"/>
+                <w:sz w:val="15"/>
               </w:rPr>
               <w:t>544.82</w:t>
             </w:r>
@@ -4229,7 +4199,7 @@
         </w:tc>
         <w:tc>
           <w:tcPr>
-            <w:tcW w:type="dxa" w:w="1505"/>
+            <w:tcW w:type="dxa" w:w="1584"/>
             <w:vAlign w:val="center"/>
             <w:tcBorders>
               <w:top w:val="none" w:sz="4" w:space="0" w:color="000000"/>
@@ -4247,7 +4217,7 @@
               <w:rPr>
                 <w:rFonts w:ascii="Times New Roman" w:hAnsi="Times New Roman"/>
                 <w:color w:val="000000"/>
-                <w:sz w:val="16"/>
+                <w:sz w:val="15"/>
               </w:rPr>
               <w:t>0.0132</w:t>
             </w:r>
@@ -4260,7 +4230,7 @@
         </w:trPr>
         <w:tc>
           <w:tcPr>
-            <w:tcW w:type="dxa" w:w="1505"/>
+            <w:tcW w:type="dxa" w:w="2117"/>
             <w:vAlign w:val="center"/>
             <w:tcBorders>
               <w:top w:val="none" w:sz="4" w:space="0" w:color="000000"/>
@@ -4278,7 +4248,7 @@
               <w:rPr>
                 <w:rFonts w:ascii="Times New Roman" w:hAnsi="Times New Roman"/>
                 <w:color w:val="000000"/>
-                <w:sz w:val="16"/>
+                <w:sz w:val="15"/>
               </w:rPr>
               <w:t>Without transfers</w:t>
             </w:r>
@@ -4286,7 +4256,7 @@
         </w:tc>
         <w:tc>
           <w:tcPr>
-            <w:tcW w:type="dxa" w:w="1505"/>
+            <w:tcW w:type="dxa" w:w="1368"/>
             <w:vAlign w:val="center"/>
             <w:tcBorders>
               <w:top w:val="none" w:sz="4" w:space="0" w:color="000000"/>
@@ -4304,7 +4274,7 @@
               <w:rPr>
                 <w:rFonts w:ascii="Times New Roman" w:hAnsi="Times New Roman"/>
                 <w:color w:val="000000"/>
-                <w:sz w:val="16"/>
+                <w:sz w:val="15"/>
               </w:rPr>
               <w:t>−252.436</w:t>
             </w:r>
@@ -4312,7 +4282,7 @@
         </w:tc>
         <w:tc>
           <w:tcPr>
-            <w:tcW w:type="dxa" w:w="1505"/>
+            <w:tcW w:type="dxa" w:w="1224"/>
             <w:vAlign w:val="center"/>
             <w:tcBorders>
               <w:top w:val="none" w:sz="4" w:space="0" w:color="000000"/>
@@ -4330,7 +4300,7 @@
               <w:rPr>
                 <w:rFonts w:ascii="Times New Roman" w:hAnsi="Times New Roman"/>
                 <w:color w:val="000000"/>
-                <w:sz w:val="16"/>
+                <w:sz w:val="15"/>
               </w:rPr>
               <w:t>0.0500</w:t>
             </w:r>
@@ -4338,7 +4308,7 @@
         </w:tc>
         <w:tc>
           <w:tcPr>
-            <w:tcW w:type="dxa" w:w="1505"/>
+            <w:tcW w:type="dxa" w:w="1368"/>
             <w:vAlign w:val="center"/>
             <w:tcBorders>
               <w:top w:val="none" w:sz="4" w:space="0" w:color="000000"/>
@@ -4356,7 +4326,7 @@
               <w:rPr>
                 <w:rFonts w:ascii="Times New Roman" w:hAnsi="Times New Roman"/>
                 <w:color w:val="000000"/>
-                <w:sz w:val="16"/>
+                <w:sz w:val="15"/>
               </w:rPr>
               <w:t>516.87</w:t>
             </w:r>
@@ -4364,7 +4334,7 @@
         </w:tc>
         <w:tc>
           <w:tcPr>
-            <w:tcW w:type="dxa" w:w="1505"/>
+            <w:tcW w:type="dxa" w:w="1368"/>
             <w:vAlign w:val="center"/>
             <w:tcBorders>
               <w:top w:val="none" w:sz="4" w:space="0" w:color="000000"/>
@@ -4382,7 +4352,7 @@
               <w:rPr>
                 <w:rFonts w:ascii="Times New Roman" w:hAnsi="Times New Roman"/>
                 <w:color w:val="000000"/>
-                <w:sz w:val="16"/>
+                <w:sz w:val="15"/>
               </w:rPr>
               <w:t>539.44</w:t>
             </w:r>
@@ -4390,7 +4360,7 @@
         </w:tc>
         <w:tc>
           <w:tcPr>
-            <w:tcW w:type="dxa" w:w="1505"/>
+            <w:tcW w:type="dxa" w:w="1584"/>
             <w:vAlign w:val="center"/>
             <w:tcBorders>
               <w:top w:val="none" w:sz="4" w:space="0" w:color="000000"/>
@@ -4408,7 +4378,7 @@
               <w:rPr>
                 <w:rFonts w:ascii="Times New Roman" w:hAnsi="Times New Roman"/>
                 <w:color w:val="000000"/>
-                <w:sz w:val="16"/>
+                <w:sz w:val="15"/>
               </w:rPr>
               <w:t>0.3790</w:t>
             </w:r>
@@ -4421,7 +4391,7 @@
         </w:trPr>
         <w:tc>
           <w:tcPr>
-            <w:tcW w:type="dxa" w:w="1505"/>
+            <w:tcW w:type="dxa" w:w="2117"/>
             <w:vAlign w:val="center"/>
             <w:tcBorders>
               <w:top w:val="none" w:sz="4" w:space="0" w:color="000000"/>
@@ -4439,7 +4409,7 @@
               <w:rPr>
                 <w:rFonts w:ascii="Times New Roman" w:hAnsi="Times New Roman"/>
                 <w:color w:val="000000"/>
-                <w:sz w:val="16"/>
+                <w:sz w:val="15"/>
               </w:rPr>
               <w:t>Without access and transfers</w:t>
             </w:r>
@@ -4447,7 +4417,7 @@
         </w:tc>
         <w:tc>
           <w:tcPr>
-            <w:tcW w:type="dxa" w:w="1505"/>
+            <w:tcW w:type="dxa" w:w="1368"/>
             <w:vAlign w:val="center"/>
             <w:tcBorders>
               <w:top w:val="none" w:sz="4" w:space="0" w:color="000000"/>
@@ -4465,7 +4435,7 @@
               <w:rPr>
                 <w:rFonts w:ascii="Times New Roman" w:hAnsi="Times New Roman"/>
                 <w:color w:val="000000"/>
-                <w:sz w:val="16"/>
+                <w:sz w:val="15"/>
               </w:rPr>
               <w:t>−255.143</w:t>
             </w:r>
@@ -4473,7 +4443,7 @@
         </w:tc>
         <w:tc>
           <w:tcPr>
-            <w:tcW w:type="dxa" w:w="1505"/>
+            <w:tcW w:type="dxa" w:w="1224"/>
             <w:vAlign w:val="center"/>
             <w:tcBorders>
               <w:top w:val="none" w:sz="4" w:space="0" w:color="000000"/>
@@ -4491,7 +4461,7 @@
               <w:rPr>
                 <w:rFonts w:ascii="Times New Roman" w:hAnsi="Times New Roman"/>
                 <w:color w:val="000000"/>
-                <w:sz w:val="16"/>
+                <w:sz w:val="15"/>
               </w:rPr>
               <w:t>0.0398</w:t>
             </w:r>
@@ -4499,7 +4469,7 @@
         </w:tc>
         <w:tc>
           <w:tcPr>
-            <w:tcW w:type="dxa" w:w="1505"/>
+            <w:tcW w:type="dxa" w:w="1368"/>
             <w:vAlign w:val="center"/>
             <w:tcBorders>
               <w:top w:val="none" w:sz="4" w:space="0" w:color="000000"/>
@@ -4517,7 +4487,7 @@
               <w:rPr>
                 <w:rFonts w:ascii="Times New Roman" w:hAnsi="Times New Roman"/>
                 <w:color w:val="000000"/>
-                <w:sz w:val="16"/>
+                <w:sz w:val="15"/>
               </w:rPr>
               <w:t>520.29</w:t>
             </w:r>
@@ -4525,7 +4495,7 @@
         </w:tc>
         <w:tc>
           <w:tcPr>
-            <w:tcW w:type="dxa" w:w="1505"/>
+            <w:tcW w:type="dxa" w:w="1368"/>
             <w:vAlign w:val="center"/>
             <w:tcBorders>
               <w:top w:val="none" w:sz="4" w:space="0" w:color="000000"/>
@@ -4543,7 +4513,7 @@
               <w:rPr>
                 <w:rFonts w:ascii="Times New Roman" w:hAnsi="Times New Roman"/>
                 <w:color w:val="000000"/>
-                <w:sz w:val="16"/>
+                <w:sz w:val="15"/>
               </w:rPr>
               <w:t>539.10</w:t>
             </w:r>
@@ -4551,7 +4521,7 @@
         </w:tc>
         <w:tc>
           <w:tcPr>
-            <w:tcW w:type="dxa" w:w="1505"/>
+            <w:tcW w:type="dxa" w:w="1584"/>
             <w:vAlign w:val="center"/>
             <w:tcBorders>
               <w:top w:val="none" w:sz="4" w:space="0" w:color="000000"/>
@@ -4569,7 +4539,7 @@
               <w:rPr>
                 <w:rFonts w:ascii="Times New Roman" w:hAnsi="Times New Roman"/>
                 <w:color w:val="000000"/>
-                <w:sz w:val="16"/>
+                <w:sz w:val="15"/>
               </w:rPr>
               <w:t>0.0453</w:t>
             </w:r>
@@ -4582,7 +4552,7 @@
         </w:trPr>
         <w:tc>
           <w:tcPr>
-            <w:tcW w:type="dxa" w:w="1505"/>
+            <w:tcW w:type="dxa" w:w="2117"/>
             <w:vAlign w:val="center"/>
             <w:tcBorders>
               <w:top w:val="none" w:sz="4" w:space="0" w:color="000000"/>
@@ -4600,7 +4570,7 @@
               <w:rPr>
                 <w:rFonts w:ascii="Times New Roman" w:hAnsi="Times New Roman"/>
                 <w:color w:val="000000"/>
-                <w:sz w:val="16"/>
+                <w:sz w:val="15"/>
               </w:rPr>
               <w:t>Without paid non-public transport†</w:t>
             </w:r>
@@ -4608,7 +4578,7 @@
         </w:tc>
         <w:tc>
           <w:tcPr>
-            <w:tcW w:type="dxa" w:w="1505"/>
+            <w:tcW w:type="dxa" w:w="1368"/>
             <w:vAlign w:val="center"/>
             <w:tcBorders>
               <w:top w:val="none" w:sz="4" w:space="0" w:color="000000"/>
@@ -4626,7 +4596,7 @@
               <w:rPr>
                 <w:rFonts w:ascii="Times New Roman" w:hAnsi="Times New Roman"/>
                 <w:color w:val="000000"/>
-                <w:sz w:val="16"/>
+                <w:sz w:val="15"/>
               </w:rPr>
               <w:t>−237.397</w:t>
             </w:r>
@@ -4634,7 +4604,7 @@
         </w:tc>
         <w:tc>
           <w:tcPr>
-            <w:tcW w:type="dxa" w:w="1505"/>
+            <w:tcW w:type="dxa" w:w="1224"/>
             <w:vAlign w:val="center"/>
             <w:tcBorders>
               <w:top w:val="none" w:sz="4" w:space="0" w:color="000000"/>
@@ -4652,7 +4622,7 @@
               <w:rPr>
                 <w:rFonts w:ascii="Times New Roman" w:hAnsi="Times New Roman"/>
                 <w:color w:val="000000"/>
-                <w:sz w:val="16"/>
+                <w:sz w:val="15"/>
               </w:rPr>
               <w:t>0.0404</w:t>
             </w:r>
@@ -4660,7 +4630,7 @@
         </w:tc>
         <w:tc>
           <w:tcPr>
-            <w:tcW w:type="dxa" w:w="1505"/>
+            <w:tcW w:type="dxa" w:w="1368"/>
             <w:vAlign w:val="center"/>
             <w:tcBorders>
               <w:top w:val="none" w:sz="4" w:space="0" w:color="000000"/>
@@ -4678,7 +4648,7 @@
               <w:rPr>
                 <w:rFonts w:ascii="Times New Roman" w:hAnsi="Times New Roman"/>
                 <w:color w:val="000000"/>
-                <w:sz w:val="16"/>
+                <w:sz w:val="15"/>
               </w:rPr>
               <w:t>488.79</w:t>
             </w:r>
@@ -4686,7 +4656,7 @@
         </w:tc>
         <w:tc>
           <w:tcPr>
-            <w:tcW w:type="dxa" w:w="1505"/>
+            <w:tcW w:type="dxa" w:w="1368"/>
             <w:vAlign w:val="center"/>
             <w:tcBorders>
               <w:top w:val="none" w:sz="4" w:space="0" w:color="000000"/>
@@ -4704,7 +4674,7 @@
               <w:rPr>
                 <w:rFonts w:ascii="Times New Roman" w:hAnsi="Times New Roman"/>
                 <w:color w:val="000000"/>
-                <w:sz w:val="16"/>
+                <w:sz w:val="15"/>
               </w:rPr>
               <w:t>514.67</w:t>
             </w:r>
@@ -4712,7 +4682,7 @@
         </w:tc>
         <w:tc>
           <w:tcPr>
-            <w:tcW w:type="dxa" w:w="1505"/>
+            <w:tcW w:type="dxa" w:w="1584"/>
             <w:vAlign w:val="center"/>
             <w:tcBorders>
               <w:top w:val="none" w:sz="4" w:space="0" w:color="000000"/>
@@ -4730,7 +4700,7 @@
               <w:rPr>
                 <w:rFonts w:ascii="Times New Roman" w:hAnsi="Times New Roman"/>
                 <w:color w:val="000000"/>
-                <w:sz w:val="16"/>
+                <w:sz w:val="15"/>
               </w:rPr>
               <w:t>—</w:t>
             </w:r>
@@ -4798,17 +4768,6 @@
     </w:p>
     <w:p>
       <w:pPr>
-        <w:sectPr>
-          <w:pgSz w:w="11909" w:h="16834"/>
-          <w:pgMar w:top="1440" w:right="1440" w:bottom="1440" w:left="1440" w:header="720" w:footer="720" w:gutter="0"/>
-          <w:docGrid w:linePitch="360"/>
-          <w:type w:val="continuous"/>
-          <w:cols w:num="2" w:space="708"/>
-        </w:sectPr>
-      </w:pPr>
-    </w:p>
-    <w:p>
-      <w:pPr>
         <w:keepNext/>
         <w:spacing w:before="160" w:after="40"/>
         <w:jc w:val="center"/>
@@ -4816,7 +4775,7 @@
       <w:r>
         <w:drawing>
           <wp:inline xmlns:a="http://schemas.openxmlformats.org/drawingml/2006/main" xmlns:pic="http://schemas.openxmlformats.org/drawingml/2006/picture">
-            <wp:extent cx="5486400" cy="3608395"/>
+            <wp:extent cx="2606040" cy="1713987"/>
             <wp:docPr id="5" name="Picture 5"/>
             <wp:cNvGraphicFramePr>
               <a:graphicFrameLocks noChangeAspect="1"/>
@@ -4837,7 +4796,7 @@
                   <pic:spPr>
                     <a:xfrm>
                       <a:off x="0" y="0"/>
-                      <a:ext cx="5486400" cy="3608395"/>
+                      <a:ext cx="2606040" cy="1713987"/>
                     </a:xfrm>
                     <a:prstGeom prst="rect"/>
                   </pic:spPr>
@@ -4850,6 +4809,7 @@
     </w:p>
     <w:p>
       <w:pPr>
+        <w:keepNext w:val="0"/>
         <w:spacing w:before="40" w:after="160"/>
         <w:jc w:val="center"/>
       </w:pPr>
@@ -4862,17 +4822,6 @@
         </w:rPr>
         <w:t>FIGURE 5. AIC and BIC for models estimated on the same sample</w:t>
       </w:r>
-    </w:p>
-    <w:p>
-      <w:pPr>
-        <w:sectPr>
-          <w:pgSz w:w="11909" w:h="16834"/>
-          <w:pgMar w:top="1440" w:right="1440" w:bottom="1440" w:left="1440" w:header="720" w:footer="720" w:gutter="0"/>
-          <w:docGrid w:linePitch="360"/>
-          <w:type w:val="continuous"/>
-          <w:cols w:num="1" w:space="708"/>
-        </w:sectPr>
-      </w:pPr>
     </w:p>
     <w:p>
       <w:pPr>
@@ -4941,6 +4890,7 @@
     </w:p>
     <w:p>
       <w:pPr>
+        <w:keepNext w:val="0"/>
         <w:spacing w:before="40" w:after="160"/>
         <w:jc w:val="center"/>
       </w:pPr>

</xml_diff>

<commit_message>
fix(layout): compact figure 06 to fit on page 5 and remove empty vertical gap
</commit_message>
<xml_diff>
--- a/docs/manuscript/en/manuscript.docx
+++ b/docs/manuscript/en/manuscript.docx
@@ -4856,7 +4856,7 @@
       <w:r>
         <w:drawing>
           <wp:inline xmlns:a="http://schemas.openxmlformats.org/drawingml/2006/main" xmlns:pic="http://schemas.openxmlformats.org/drawingml/2006/picture">
-            <wp:extent cx="5486400" cy="6396700"/>
+            <wp:extent cx="5486400" cy="3608395"/>
             <wp:docPr id="6" name="Picture 6"/>
             <wp:cNvGraphicFramePr>
               <a:graphicFrameLocks noChangeAspect="1"/>
@@ -4877,7 +4877,7 @@
                   <pic:spPr>
                     <a:xfrm>
                       <a:off x="0" y="0"/>
-                      <a:ext cx="5486400" cy="6396700"/>
+                      <a:ext cx="5486400" cy="3608395"/>
                     </a:xfrm>
                     <a:prstGeom prst="rect"/>
                   </pic:spPr>

</xml_diff>

<commit_message>
feat(math): convert manuscript equations to clean LaTeX and native Word Equation (OMML) objects
</commit_message>
<xml_diff>
--- a/docs/manuscript/en/manuscript.docx
+++ b/docs/manuscript/en/manuscript.docx
@@ -2101,37 +2101,7 @@
           <w:rFonts w:ascii="Times New Roman" w:hAnsi="Times New Roman"/>
           <w:sz w:val="19"/>
         </w:rPr>
-        <w:t xml:space="preserve">The utility of alternative </w:t>
-      </w:r>
-      <w:r>
-        <w:rPr>
-          <w:rFonts w:ascii="Times New Roman" w:hAnsi="Times New Roman"/>
-          <w:i/>
-          <w:sz w:val="19"/>
-        </w:rPr>
-        <w:t>j</w:t>
-      </w:r>
-      <w:r>
-        <w:rPr>
-          <w:rFonts w:ascii="Times New Roman" w:hAnsi="Times New Roman"/>
-          <w:sz w:val="19"/>
-        </w:rPr>
-        <w:t xml:space="preserve"> for respondent </w:t>
-      </w:r>
-      <w:r>
-        <w:rPr>
-          <w:rFonts w:ascii="Times New Roman" w:hAnsi="Times New Roman"/>
-          <w:i/>
-          <w:sz w:val="19"/>
-        </w:rPr>
-        <w:t>i</w:t>
-      </w:r>
-      <w:r>
-        <w:rPr>
-          <w:rFonts w:ascii="Times New Roman" w:hAnsi="Times New Roman"/>
-          <w:sz w:val="19"/>
-        </w:rPr>
-        <w:t xml:space="preserve"> is:</w:t>
+        <w:t>The utility of alternative $j$ for respondent $i$ is specified as:</w:t>
       </w:r>
     </w:p>
     <w:p>
@@ -2139,14 +2109,184 @@
         <w:spacing w:before="80" w:after="80"/>
         <w:jc w:val="center"/>
       </w:pPr>
-      <w:r>
-        <w:rPr>
-          <w:rFonts w:ascii="Times New Roman" w:hAnsi="Times New Roman"/>
-          <w:i/>
-          <w:sz w:val="18"/>
-        </w:rPr>
-        <w:t>U_{ij}=\beta_{time}Time_{ij}+\beta_{cost}Cost_{ij}+\beta_{transfer}Transfer_{ij}+\beta_{access}Access_{ij}+\beta_{comfort}Comfort_{ij}+\beta_{reliability}Reliability_{ij}.</w:t>
-      </w:r>
+      <m:oMathPara>
+        <m:oMath>
+          <m:sSub>
+            <m:e>
+              <m:r>
+                <m:t>U</m:t>
+              </m:r>
+            </m:e>
+            <m:sub>
+              <m:r>
+                <m:t>ij</m:t>
+              </m:r>
+            </m:sub>
+          </m:sSub>
+          <m:r>
+            <m:t>=</m:t>
+          </m:r>
+          <m:sSub>
+            <m:e>
+              <m:r>
+                <m:t>β</m:t>
+              </m:r>
+            </m:e>
+            <m:sub>
+              <m:r>
+                <m:t>time</m:t>
+              </m:r>
+            </m:sub>
+          </m:sSub>
+          <m:sSub>
+            <m:e>
+              <m:r>
+                <m:t>Time</m:t>
+              </m:r>
+            </m:e>
+            <m:sub>
+              <m:r>
+                <m:t>ij</m:t>
+              </m:r>
+            </m:sub>
+          </m:sSub>
+          <m:r>
+            <m:t>+</m:t>
+          </m:r>
+          <m:sSub>
+            <m:e>
+              <m:r>
+                <m:t>β</m:t>
+              </m:r>
+            </m:e>
+            <m:sub>
+              <m:r>
+                <m:t>cost</m:t>
+              </m:r>
+            </m:sub>
+          </m:sSub>
+          <m:sSub>
+            <m:e>
+              <m:r>
+                <m:t>Cost</m:t>
+              </m:r>
+            </m:e>
+            <m:sub>
+              <m:r>
+                <m:t>ij</m:t>
+              </m:r>
+            </m:sub>
+          </m:sSub>
+          <m:r>
+            <m:t>+</m:t>
+          </m:r>
+          <m:sSub>
+            <m:e>
+              <m:r>
+                <m:t>β</m:t>
+              </m:r>
+            </m:e>
+            <m:sub>
+              <m:r>
+                <m:t>transfer</m:t>
+              </m:r>
+            </m:sub>
+          </m:sSub>
+          <m:sSub>
+            <m:e>
+              <m:r>
+                <m:t>Transfer</m:t>
+              </m:r>
+            </m:e>
+            <m:sub>
+              <m:r>
+                <m:t>ij</m:t>
+              </m:r>
+            </m:sub>
+          </m:sSub>
+          <m:r>
+            <m:t>+</m:t>
+          </m:r>
+          <m:sSub>
+            <m:e>
+              <m:r>
+                <m:t>β</m:t>
+              </m:r>
+            </m:e>
+            <m:sub>
+              <m:r>
+                <m:t>access</m:t>
+              </m:r>
+            </m:sub>
+          </m:sSub>
+          <m:sSub>
+            <m:e>
+              <m:r>
+                <m:t>Access</m:t>
+              </m:r>
+            </m:e>
+            <m:sub>
+              <m:r>
+                <m:t>ij</m:t>
+              </m:r>
+            </m:sub>
+          </m:sSub>
+          <m:r>
+            <m:t>+</m:t>
+          </m:r>
+          <m:sSub>
+            <m:e>
+              <m:r>
+                <m:t>β</m:t>
+              </m:r>
+            </m:e>
+            <m:sub>
+              <m:r>
+                <m:t>comfort</m:t>
+              </m:r>
+            </m:sub>
+          </m:sSub>
+          <m:sSub>
+            <m:e>
+              <m:r>
+                <m:t>Comfort</m:t>
+              </m:r>
+            </m:e>
+            <m:sub>
+              <m:r>
+                <m:t>ij</m:t>
+              </m:r>
+            </m:sub>
+          </m:sSub>
+          <m:r>
+            <m:t>+</m:t>
+          </m:r>
+          <m:sSub>
+            <m:e>
+              <m:r>
+                <m:t>β</m:t>
+              </m:r>
+            </m:e>
+            <m:sub>
+              <m:r>
+                <m:t>reliability</m:t>
+              </m:r>
+            </m:sub>
+          </m:sSub>
+          <m:sSub>
+            <m:e>
+              <m:r>
+                <m:t>Reliability</m:t>
+              </m:r>
+            </m:e>
+            <m:sub>
+              <m:r>
+                <m:t>ij</m:t>
+              </m:r>
+            </m:sub>
+          </m:sSub>
+        </m:oMath>
+      </m:oMathPara>
     </w:p>
     <w:p>
       <w:pPr>
@@ -2158,7 +2298,7 @@
           <w:rFonts w:ascii="Times New Roman" w:hAnsi="Times New Roman"/>
           <w:sz w:val="19"/>
         </w:rPr>
-        <w:t>The MNL probability is:</w:t>
+        <w:t>The multinomial logit (MNL) probability is expressed as:</w:t>
       </w:r>
     </w:p>
     <w:p>
@@ -2166,14 +2306,184 @@
         <w:spacing w:before="80" w:after="80"/>
         <w:jc w:val="center"/>
       </w:pPr>
-      <w:r>
-        <w:rPr>
-          <w:rFonts w:ascii="Times New Roman" w:hAnsi="Times New Roman"/>
-          <w:i/>
-          <w:sz w:val="18"/>
-        </w:rPr>
-        <w:t>P_{ij}=\frac{\exp(U_{ij})}{\sum_m\exp(U_{im})}.</w:t>
-      </w:r>
+      <m:oMathPara>
+        <m:oMath>
+          <m:sSub>
+            <m:e>
+              <m:r>
+                <m:t>U</m:t>
+              </m:r>
+            </m:e>
+            <m:sub>
+              <m:r>
+                <m:t>ij</m:t>
+              </m:r>
+            </m:sub>
+          </m:sSub>
+          <m:r>
+            <m:t>=</m:t>
+          </m:r>
+          <m:sSub>
+            <m:e>
+              <m:r>
+                <m:t>β</m:t>
+              </m:r>
+            </m:e>
+            <m:sub>
+              <m:r>
+                <m:t>time</m:t>
+              </m:r>
+            </m:sub>
+          </m:sSub>
+          <m:sSub>
+            <m:e>
+              <m:r>
+                <m:t>Time</m:t>
+              </m:r>
+            </m:e>
+            <m:sub>
+              <m:r>
+                <m:t>ij</m:t>
+              </m:r>
+            </m:sub>
+          </m:sSub>
+          <m:r>
+            <m:t>+</m:t>
+          </m:r>
+          <m:sSub>
+            <m:e>
+              <m:r>
+                <m:t>β</m:t>
+              </m:r>
+            </m:e>
+            <m:sub>
+              <m:r>
+                <m:t>cost</m:t>
+              </m:r>
+            </m:sub>
+          </m:sSub>
+          <m:sSub>
+            <m:e>
+              <m:r>
+                <m:t>Cost</m:t>
+              </m:r>
+            </m:e>
+            <m:sub>
+              <m:r>
+                <m:t>ij</m:t>
+              </m:r>
+            </m:sub>
+          </m:sSub>
+          <m:r>
+            <m:t>+</m:t>
+          </m:r>
+          <m:sSub>
+            <m:e>
+              <m:r>
+                <m:t>β</m:t>
+              </m:r>
+            </m:e>
+            <m:sub>
+              <m:r>
+                <m:t>transfer</m:t>
+              </m:r>
+            </m:sub>
+          </m:sSub>
+          <m:sSub>
+            <m:e>
+              <m:r>
+                <m:t>Transfer</m:t>
+              </m:r>
+            </m:e>
+            <m:sub>
+              <m:r>
+                <m:t>ij</m:t>
+              </m:r>
+            </m:sub>
+          </m:sSub>
+          <m:r>
+            <m:t>+</m:t>
+          </m:r>
+          <m:sSub>
+            <m:e>
+              <m:r>
+                <m:t>β</m:t>
+              </m:r>
+            </m:e>
+            <m:sub>
+              <m:r>
+                <m:t>access</m:t>
+              </m:r>
+            </m:sub>
+          </m:sSub>
+          <m:sSub>
+            <m:e>
+              <m:r>
+                <m:t>Access</m:t>
+              </m:r>
+            </m:e>
+            <m:sub>
+              <m:r>
+                <m:t>ij</m:t>
+              </m:r>
+            </m:sub>
+          </m:sSub>
+          <m:r>
+            <m:t>+</m:t>
+          </m:r>
+          <m:sSub>
+            <m:e>
+              <m:r>
+                <m:t>β</m:t>
+              </m:r>
+            </m:e>
+            <m:sub>
+              <m:r>
+                <m:t>comfort</m:t>
+              </m:r>
+            </m:sub>
+          </m:sSub>
+          <m:sSub>
+            <m:e>
+              <m:r>
+                <m:t>Comfort</m:t>
+              </m:r>
+            </m:e>
+            <m:sub>
+              <m:r>
+                <m:t>ij</m:t>
+              </m:r>
+            </m:sub>
+          </m:sSub>
+          <m:r>
+            <m:t>+</m:t>
+          </m:r>
+          <m:sSub>
+            <m:e>
+              <m:r>
+                <m:t>β</m:t>
+              </m:r>
+            </m:e>
+            <m:sub>
+              <m:r>
+                <m:t>reliability</m:t>
+              </m:r>
+            </m:sub>
+          </m:sSub>
+          <m:sSub>
+            <m:e>
+              <m:r>
+                <m:t>Reliability</m:t>
+              </m:r>
+            </m:e>
+            <m:sub>
+              <m:r>
+                <m:t>ij</m:t>
+              </m:r>
+            </m:sub>
+          </m:sSub>
+        </m:oMath>
+      </m:oMathPara>
     </w:p>
     <w:p>
       <w:pPr>
@@ -2185,7 +2495,7 @@
           <w:rFonts w:ascii="Times New Roman" w:hAnsi="Times New Roman"/>
           <w:sz w:val="19"/>
         </w:rPr>
-        <w:t>The main model adds \(\alpha_{private}I(private)_{ij}\), with public transport as the reference. Parameters were estimated using Newton–Raphson. Ordinary standard errors are the primary inference because each final UUID contributes one observation. Fit is assessed through log-likelihood, McFadden ρ², AIC, and BIC.</w:t>
+        <w:t>The main model adds $\alpha_{\text{private}} I(\text{private})_{ij}$, with public transport as the reference category. Parameters were estimated using Newton–Raphson. Ordinary standard errors are the primary inference because each final UUID contributes one observation. Fit is assessed through log-likelihood, McFadden $\rho^2$, AIC, and BIC.</w:t>
       </w:r>
     </w:p>
     <w:p>

</xml_diff>

<commit_message>
docs(references): update literature review with recent 5-year transport journal references
</commit_message>
<xml_diff>
--- a/docs/manuscript/en/manuscript.docx
+++ b/docs/manuscript/en/manuscript.docx
@@ -133,7 +133,7 @@
           <w:rFonts w:ascii="Times New Roman" w:hAnsi="Times New Roman"/>
           <w:sz w:val="19"/>
         </w:rPr>
-        <w:t>Random utility theory represents choice as a comparison of alternative utilities (McFadden 1974; Ben-Akiva &amp; Lerman 1985). Multinomial Logit (MNL) is widely used because choice probabilities can be linked directly to alternative attributes and estimated by maximum likelihood (Train 2009). Travel time and cost are normally expected to reduce utility, whereas comfort and reliability should increase it. Access and transfers are also important because out-of-vehicle time is often valued differently from in-vehicle time (Wardman 2004), and travel-time uncertainty carries its own disutility (Bates et al. 2001).</w:t>
+        <w:t>Random utility theory represents choice as a comparison of alternative utilities (McFadden 1974; Ben-Akiva &amp; Lerman 1985). Multinomial Logit (MNL) remains the cornerstone of contemporary mode-choice modelling because it connects choice probabilities directly to travel attributes and permits parameter estimation via maximum likelihood (Train 2009; Zhao et al. 2020). Recent literature indicates that travel time and monetary cost represent primary sources of disutility, whereas operational reliability, service quality, and comfort significantly enhance the attractiveness of public transport options (Eldeeb &amp; Mohamed 2020; Ranjan &amp; Sinha 2024). Moreover, transfer convenience and first-mile/last-mile access distance have consistently been identified as critical determinants governing willingness to shift from private motor vehicles to integrated rail and feeder transit systems (Lu et al. 2023; Ramos-Santiago 2022; Lieu &amp; Akar 2025).</w:t>
       </w:r>
     </w:p>
     <w:p>
@@ -146,7 +146,7 @@
           <w:rFonts w:ascii="Times New Roman" w:hAnsi="Times New Roman"/>
           <w:sz w:val="19"/>
         </w:rPr>
-        <w:t>A basic model remains limited. Responsiveness to service attributes may vary across individuals (Bhat 1998), while alternative-specific constants can capture baseline preferences omitted from measured attributes (Ben-Akiva &amp; Lerman 1985). Moreover, a choice stated before travelling is not equivalent to observed realised behaviour; choice context and scenario realism must therefore be reported transparently (Louviere et al. 2000).</w:t>
+        <w:t>Nevertheless, basic multinomial logit models face well-known challenges in capturing unobserved intrinsic preferences. Travel mode choices are frequently shaped by habits, modal availability, or perceived flexibility that are not fully reflected in service-level variables alone (Zhao et al. 2020; Ranjan &amp; Sinha 2024). Consequently, incorporating alternative-specific constants (ASCs) is essential to disentangle innate modal bias from the marginal utility of measured level-of-service attributes (Ben-Akiva &amp; Lerman 1985; Train 2009). Furthermore, constructing choice sets that reflect realistic, routine travel activities specified by travelers themselves provides a more grounded behavioral context for empirical estimation (Lu et al. 2023).</w:t>
       </w:r>
     </w:p>
     <w:p>
@@ -5421,34 +5421,6 @@
           <w:rFonts w:ascii="Times New Roman" w:hAnsi="Times New Roman"/>
           <w:sz w:val="19"/>
         </w:rPr>
-        <w:t xml:space="preserve">Bates, J., Polak, J., Jones, P. &amp; Cook, A. 2001. The valuation of reliability for personal travel. </w:t>
-      </w:r>
-      <w:r>
-        <w:rPr>
-          <w:rFonts w:ascii="Times New Roman" w:hAnsi="Times New Roman"/>
-          <w:i/>
-          <w:sz w:val="19"/>
-        </w:rPr>
-        <w:t>Transportation Research Part E</w:t>
-      </w:r>
-      <w:r>
-        <w:rPr>
-          <w:rFonts w:ascii="Times New Roman" w:hAnsi="Times New Roman"/>
-          <w:sz w:val="19"/>
-        </w:rPr>
-        <w:t xml:space="preserve"> 37(2–3): 191–229. https://doi.org/10.1016/S1366-5545(00)00011-9</w:t>
-      </w:r>
-    </w:p>
-    <w:p>
-      <w:pPr>
-        <w:spacing w:before="0" w:after="80" w:line="252" w:lineRule="auto"/>
-        <w:jc w:val="both"/>
-      </w:pPr>
-      <w:r>
-        <w:rPr>
-          <w:rFonts w:ascii="Times New Roman" w:hAnsi="Times New Roman"/>
-          <w:sz w:val="19"/>
-        </w:rPr>
         <w:t xml:space="preserve">Ben-Akiva, M. &amp; Lerman, S.R. 1985. </w:t>
       </w:r>
       <w:r>
@@ -5465,34 +5437,6 @@
           <w:sz w:val="19"/>
         </w:rPr>
         <w:t>. Cambridge, MA: MIT Press.</w:t>
-      </w:r>
-    </w:p>
-    <w:p>
-      <w:pPr>
-        <w:spacing w:before="0" w:after="80" w:line="252" w:lineRule="auto"/>
-        <w:jc w:val="both"/>
-      </w:pPr>
-      <w:r>
-        <w:rPr>
-          <w:rFonts w:ascii="Times New Roman" w:hAnsi="Times New Roman"/>
-          <w:sz w:val="19"/>
-        </w:rPr>
-        <w:t xml:space="preserve">Bhat, C.R. 1998. Accommodating variations in responsiveness to level-of-service measures in travel mode choice modeling. </w:t>
-      </w:r>
-      <w:r>
-        <w:rPr>
-          <w:rFonts w:ascii="Times New Roman" w:hAnsi="Times New Roman"/>
-          <w:i/>
-          <w:sz w:val="19"/>
-        </w:rPr>
-        <w:t>Transportation Research Part A</w:t>
-      </w:r>
-      <w:r>
-        <w:rPr>
-          <w:rFonts w:ascii="Times New Roman" w:hAnsi="Times New Roman"/>
-          <w:sz w:val="19"/>
-        </w:rPr>
-        <w:t xml:space="preserve"> 32(7): 495–507. https://doi.org/10.1016/S0965-8564(98)00011-1</w:t>
       </w:r>
     </w:p>
     <w:p>
@@ -5561,7 +5505,7 @@
           <w:rFonts w:ascii="Times New Roman" w:hAnsi="Times New Roman"/>
           <w:sz w:val="19"/>
         </w:rPr>
-        <w:t xml:space="preserve">Hensher, D.A., Rose, J.M. &amp; Greene, W.H. 2015. </w:t>
+        <w:t xml:space="preserve">Eldeeb, G. &amp; Mohamed, M. 2020. Quantifying preference heterogeneity in transit service desired quality using a latent class choice model. </w:t>
       </w:r>
       <w:r>
         <w:rPr>
@@ -5569,14 +5513,14 @@
           <w:i/>
           <w:sz w:val="19"/>
         </w:rPr>
-        <w:t>Applied Choice Analysis</w:t>
+        <w:t>Transportation Research Part A: Policy and Practice</w:t>
       </w:r>
       <w:r>
         <w:rPr>
           <w:rFonts w:ascii="Times New Roman" w:hAnsi="Times New Roman"/>
           <w:sz w:val="19"/>
         </w:rPr>
-        <w:t>. Cambridge: Cambridge University Press. https://doi.org/10.1017/CBO9781316136232</w:t>
+        <w:t xml:space="preserve"> 139: 119–133. https://doi.org/10.1016/j.tra.2020.07.006</w:t>
       </w:r>
     </w:p>
     <w:p>
@@ -5589,7 +5533,7 @@
           <w:rFonts w:ascii="Times New Roman" w:hAnsi="Times New Roman"/>
           <w:sz w:val="19"/>
         </w:rPr>
-        <w:t xml:space="preserve">Louviere, J.J., Hensher, D.A. &amp; Swait, J.D. 2000. </w:t>
+        <w:t xml:space="preserve">Lieu, S. &amp; Akar, G. 2025. Understanding rail users' mode choice behavior for first and last mile travel. </w:t>
       </w:r>
       <w:r>
         <w:rPr>
@@ -5597,14 +5541,42 @@
           <w:i/>
           <w:sz w:val="19"/>
         </w:rPr>
-        <w:t>Stated Choice Methods: Analysis and Applications</w:t>
+        <w:t>Journal of Transport Geography</w:t>
       </w:r>
       <w:r>
         <w:rPr>
           <w:rFonts w:ascii="Times New Roman" w:hAnsi="Times New Roman"/>
           <w:sz w:val="19"/>
         </w:rPr>
-        <w:t>. Cambridge: Cambridge University Press. https://doi.org/10.1017/CBO9780511753831</w:t>
+        <w:t xml:space="preserve"> 125: 104214. https://doi.org/10.1016/j.jtrangeo.2025.104214</w:t>
+      </w:r>
+    </w:p>
+    <w:p>
+      <w:pPr>
+        <w:spacing w:before="0" w:after="80" w:line="252" w:lineRule="auto"/>
+        <w:jc w:val="both"/>
+      </w:pPr>
+      <w:r>
+        <w:rPr>
+          <w:rFonts w:ascii="Times New Roman" w:hAnsi="Times New Roman"/>
+          <w:sz w:val="19"/>
+        </w:rPr>
+        <w:t xml:space="preserve">Lu, Y., Prato, C.G. &amp; Sipe, N. 2023. Understanding the role of household modality style on first and last mile travel mode choice and public transit station choice. </w:t>
+      </w:r>
+      <w:r>
+        <w:rPr>
+          <w:rFonts w:ascii="Times New Roman" w:hAnsi="Times New Roman"/>
+          <w:i/>
+          <w:sz w:val="19"/>
+        </w:rPr>
+        <w:t>Travel Behaviour and Society</w:t>
+      </w:r>
+      <w:r>
+        <w:rPr>
+          <w:rFonts w:ascii="Times New Roman" w:hAnsi="Times New Roman"/>
+          <w:sz w:val="19"/>
+        </w:rPr>
+        <w:t xml:space="preserve"> 32: 100580. https://doi.org/10.1016/j.tbs.2023.100580</w:t>
       </w:r>
     </w:p>
     <w:p>
@@ -5645,6 +5617,62 @@
           <w:rFonts w:ascii="Times New Roman" w:hAnsi="Times New Roman"/>
           <w:sz w:val="19"/>
         </w:rPr>
+        <w:t xml:space="preserve">Ramos-Santiago, L. 2022. Does walkability around feeder bus-stops influence rapid-transit station boardings? </w:t>
+      </w:r>
+      <w:r>
+        <w:rPr>
+          <w:rFonts w:ascii="Times New Roman" w:hAnsi="Times New Roman"/>
+          <w:i/>
+          <w:sz w:val="19"/>
+        </w:rPr>
+        <w:t>Journal of Public Transportation</w:t>
+      </w:r>
+      <w:r>
+        <w:rPr>
+          <w:rFonts w:ascii="Times New Roman" w:hAnsi="Times New Roman"/>
+          <w:sz w:val="19"/>
+        </w:rPr>
+        <w:t xml:space="preserve"> 24: 100026. https://doi.org/10.1016/j.jpubtr.2022.100026</w:t>
+      </w:r>
+    </w:p>
+    <w:p>
+      <w:pPr>
+        <w:spacing w:before="0" w:after="80" w:line="252" w:lineRule="auto"/>
+        <w:jc w:val="both"/>
+      </w:pPr>
+      <w:r>
+        <w:rPr>
+          <w:rFonts w:ascii="Times New Roman" w:hAnsi="Times New Roman"/>
+          <w:sz w:val="19"/>
+        </w:rPr>
+        <w:t xml:space="preserve">Ranjan, R. &amp; Sinha, S. 2024. Mode choice analysis for work trips of urban residents using multinomial logit model. </w:t>
+      </w:r>
+      <w:r>
+        <w:rPr>
+          <w:rFonts w:ascii="Times New Roman" w:hAnsi="Times New Roman"/>
+          <w:i/>
+          <w:sz w:val="19"/>
+        </w:rPr>
+        <w:t>Innovative Infrastructure Solutions</w:t>
+      </w:r>
+      <w:r>
+        <w:rPr>
+          <w:rFonts w:ascii="Times New Roman" w:hAnsi="Times New Roman"/>
+          <w:sz w:val="19"/>
+        </w:rPr>
+        <w:t xml:space="preserve"> 9(5): 181. https://doi.org/10.1007/s41062-024-01681-5</w:t>
+      </w:r>
+    </w:p>
+    <w:p>
+      <w:pPr>
+        <w:spacing w:before="0" w:after="80" w:line="252" w:lineRule="auto"/>
+        <w:jc w:val="both"/>
+      </w:pPr>
+      <w:r>
+        <w:rPr>
+          <w:rFonts w:ascii="Times New Roman" w:hAnsi="Times New Roman"/>
+          <w:sz w:val="19"/>
+        </w:rPr>
         <w:t xml:space="preserve">Train, K.E. 2009. </w:t>
       </w:r>
       <w:r>
@@ -5673,7 +5701,7 @@
           <w:rFonts w:ascii="Times New Roman" w:hAnsi="Times New Roman"/>
           <w:sz w:val="19"/>
         </w:rPr>
-        <w:t xml:space="preserve">Wardman, M. 2004. Public transport values of time. </w:t>
+        <w:t xml:space="preserve">Zhao, X., Yan, X., Yu, A. &amp; Van Hentenryck, P. 2020. Prediction and behavioral analysis of travel mode choice: A comparison of machine learning and logit models. </w:t>
       </w:r>
       <w:r>
         <w:rPr>
@@ -5681,14 +5709,14 @@
           <w:i/>
           <w:sz w:val="19"/>
         </w:rPr>
-        <w:t>Transport Policy</w:t>
+        <w:t>Travel Behaviour and Society</w:t>
       </w:r>
       <w:r>
         <w:rPr>
           <w:rFonts w:ascii="Times New Roman" w:hAnsi="Times New Roman"/>
           <w:sz w:val="19"/>
         </w:rPr>
-        <w:t xml:space="preserve"> 11(4): 363–377. https://doi.org/10.1016/j.tranpol.2004.05.001</w:t>
+        <w:t xml:space="preserve"> 20: 22–35. https://doi.org/10.1016/j.tbs.2020.02.003</w:t>
       </w:r>
     </w:p>
     <w:sectPr>

</xml_diff>

<commit_message>
docs(literature): contextualise results and discussion with 2020-2025 transport citations
</commit_message>
<xml_diff>
--- a/docs/manuscript/en/manuscript.docx
+++ b/docs/manuscript/en/manuscript.docx
@@ -3908,7 +3908,7 @@
           <w:rFonts w:ascii="Times New Roman" w:hAnsi="Times New Roman"/>
           <w:sz w:val="19"/>
         </w:rPr>
-        <w:t>The ASC improved log-likelihood and AIC, although the increase in ρ² from 0.0397 to 0.0514 still indicates low explanatory power. The private-vehicle ASC was positive and significant (β=0.610), indicating an inclination towards private vehicles beyond measured attributes. Reliability was positive and significant as theoretically expected. Time and cost were negative but insignificant.</w:t>
+        <w:t>The inclusion of the ASC improved the log-likelihood and reduced AIC, although the increase in ρ² from 0.0397 to 0.0514 still reflects a modest level of explanatory power. Such moderate goodness-of-fit aligns with findings in contemporary urban mode-choice literature, which demonstrate that discrete choice models based purely on engineering-level service attributes often face limitations in explaining individual travel decisions without incorporating latent attitudes or perceptual variables (Zhao et al. 2020; Eldeeb &amp; Mohamed 2020). The positive and statistically significant private-vehicle ASC (β=0.610; p&lt;0.05) confirms a pronounced intrinsic modal bias toward private motorized transport that persists after controlling for measured journey time and monetary cost (Ranjan &amp; Sinha 2024). Meanwhile, service reliability exerted a positive and statistically significant influence on utility (β=0.353; p&lt;0.05), corroborating recent empirical evidence that schedule predictability and punctuality represent foremost determinants in attracting transit riders (Eldeeb &amp; Mohamed 2020). Travel time and monetary cost displayed theoretically expected negative signs but remained statistically insignificant.</w:t>
       </w:r>
     </w:p>
     <w:p>
@@ -3921,7 +3921,7 @@
           <w:rFonts w:ascii="Times New Roman" w:hAnsi="Times New Roman"/>
           <w:sz w:val="19"/>
         </w:rPr>
-        <w:t>Access distance was positive and significant, contrary to theory. This is not interpreted as a preference for longer access. Zero access for private vehicles, differences in network coverage, and system-derived proxies may cause the parameter to capture alternative structure or unmodelled spatial factors. Comfort became insignificant after including the ASC, suggesting association between the comfort proxy and mode identity.</w:t>
+        <w:t>Access distance was positive and statistically significant, which runs contrary to standard theoretical expectations regarding walking disutility. This outcome warrants cautious interpretation within the context of urban first-mile/last-mile integration: private vehicles naturally carry zero walking access distance, spatial coverage across feeder bus corridors is uneven, and reliance on network-based distance proxies may lead the access parameter to absorb spatial structural effects or differential transit accessibility across origins (Lu et al. 2023; Ramos-Santiago 2022; Lieu &amp; Akar 2025). Thus, this positive coefficient is not interpreted as user preference for longer walking distances, but rather reflects the empirical complexity of transit catchment accessibility in emerging metropolitan networks (Lieu &amp; Akar 2025). The comfort parameter lost significance once the ASC was introduced, suggesting that systemic comfort proxies overlap substantially with modal identity.</w:t>
       </w:r>
     </w:p>
     <w:p>
@@ -5251,7 +5251,7 @@
           <w:rFonts w:ascii="Times New Roman" w:hAnsi="Times New Roman"/>
           <w:sz w:val="19"/>
         </w:rPr>
-        <w:t>The results support prioritising reliability: more predictable schedules and consistent arrival information may strengthen public transport attractiveness. The positive ASC suggests that habit, privacy, flexibility, vehicle availability, or other omitted factors continue to favour private vehicles. Policy should therefore address uncertainty and transfer barriers rather than focusing solely on travel time.</w:t>
+        <w:t>The empirical findings support prioritizing service reliability: enhancing operational schedule adherence and ensuring consistent arrival information represent critical policy levers for bolstering public transport competitiveness against private vehicles (Eldeeb &amp; Mohamed 2020; Ranjan &amp; Sinha 2024). The significant positive ASC for private vehicles indicates that deeply entrenched habits, perceived convenience, privacy, and motor vehicle availability remain formidable impediments to voluntary modal shift in Indonesian urban settings (Ranjan &amp; Sinha 2024; Zhao et al. 2020). Furthermore, the insights gained from transfer and access considerations highlight the pressing necessity to improve pedestrian infrastructure and physical integration around feeder bus stops and LRT stations to alleviate transfer friction (Ramos-Santiago 2022; Lu et al. 2023). Urban transport policy in Palembang must therefore look beyond simple fare subsidies or in-vehicle speed enhancements, focusing instead on mitigating arrival uncertainty and upgrading active first-mile/last-mile access environments (Lieu &amp; Akar 2025).</w:t>
       </w:r>
     </w:p>
     <w:p>
@@ -5264,7 +5264,7 @@
           <w:rFonts w:ascii="Times New Roman" w:hAnsi="Times New Roman"/>
           <w:sz w:val="19"/>
         </w:rPr>
-        <w:t>Interpretation is limited by convenience sampling, unverified trip realisation, two collection modes, and comfort, reliability, headway, and speed parameters partly based on system assumptions. MNL also imposes the independence of irrelevant alternatives property (Train 2009). Low explanatory power and the unexpected access sign indicate the need for observed operations, richer access measures, attitudinal variables, and heterogeneity models.</w:t>
+        <w:t>Interpretation is limited by convenience sampling, unverified trip realisation, two collection modes, and comfort, reliability, headway, and speed parameters partly based on system assumptions. MNL also imposes the independence of irrelevant alternatives property (Train 2009). Low explanatory power and the unexpected access sign indicate the need for observed operations, richer access measures, attitudinal variables, and heterogeneity models (Zhao et al. 2020; Eldeeb &amp; Mohamed 2020).</w:t>
       </w:r>
     </w:p>
     <w:p>

</xml_diff>